<commit_message>
docs: adiciona revisao de dissertacao OR/PR, dissertacao revista pelo Galletta e atualiza relatorios
</commit_message>
<xml_diff>
--- a/RELATORIO_REVISAO_NUMERICA.docx
+++ b/RELATORIO_REVISAO_NUMERICA.docx
@@ -197,79 +197,163 @@
         <w:rPr>
           <w:rStyle w:val="VerbatimChar"/>
         </w:rPr>
+        <w:t xml:space="preserve">tab_modelo_{A,B,C}_PR.csv</w:t>
+      </w:r>
+      <w:r>
+        <w:t xml:space="preserve"> </w:t>
+      </w:r>
+      <w:r>
+        <w:t xml:space="preserve">(originalmente</w:t>
+      </w:r>
+      <w:r>
+        <w:t xml:space="preserve"> </w:t>
+      </w:r>
+      <w:r>
+        <w:rPr>
+          <w:rStyle w:val="VerbatimChar"/>
+        </w:rPr>
+        <w:t xml:space="preserve">_OR.csv</w:t>
+      </w:r>
+      <w:r>
+        <w:t xml:space="preserve">; migrados para PR em 14/06/2026),</w:t>
+      </w:r>
+      <w:r>
+        <w:t xml:space="preserve"> </w:t>
+      </w:r>
+      <w:r>
+        <w:rPr>
+          <w:rStyle w:val="VerbatimChar"/>
+        </w:rPr>
+        <w:t xml:space="preserve">tab_escore_pre_natal_*.csv</w:t>
+      </w:r>
+      <w:r>
+        <w:t xml:space="preserve">,</w:t>
+      </w:r>
+      <w:r>
+        <w:t xml:space="preserve"> </w:t>
+      </w:r>
+      <w:r>
+        <w:rPr>
+          <w:rStyle w:val="VerbatimChar"/>
+        </w:rPr>
+        <w:t xml:space="preserve">results/figures/fig_obj6_*</w:t>
+      </w:r>
+      <w:r>
+        <w:t xml:space="preserve">,</w:t>
+      </w:r>
+      <w:r>
+        <w:t xml:space="preserve"> </w:t>
+      </w:r>
+      <w:r>
+        <w:rPr>
+          <w:rStyle w:val="VerbatimChar"/>
+        </w:rPr>
+        <w:t xml:space="preserve">results/RELATORIO_RESULTADOS_MODELOS_PREDITIVOS.md</w:t>
+      </w:r>
+      <w:r>
+        <w:t xml:space="preserve">,</w:t>
+      </w:r>
+      <w:r>
+        <w:t xml:space="preserve"> </w:t>
+      </w:r>
+      <w:r>
+        <w:rPr>
+          <w:rStyle w:val="VerbatimChar"/>
+        </w:rPr>
+        <w:t xml:space="preserve">results/RELATORIO_MODELOS_PREDITIVOS_CESAREA.md</w:t>
+      </w:r>
+      <w:r>
+        <w:t xml:space="preserve">,</w:t>
+      </w:r>
+      <w:r>
+        <w:t xml:space="preserve"> </w:t>
+      </w:r>
+      <w:r>
+        <w:rPr>
+          <w:rStyle w:val="VerbatimChar"/>
+        </w:rPr>
+        <w:t xml:space="preserve">results/FERRAMENTA_CLINICA_ESCORE_PRE_NATAL.md</w:t>
+      </w:r>
+      <w:r>
+        <w:t xml:space="preserve">,</w:t>
+      </w:r>
+      <w:r>
+        <w:t xml:space="preserve"> </w:t>
+      </w:r>
+      <w:r>
+        <w:rPr>
+          <w:rStyle w:val="VerbatimChar"/>
+        </w:rPr>
+        <w:t xml:space="preserve">results/calculadora_risco_cesarea.html</w:t>
+      </w:r>
+      <w:r>
+        <w:t xml:space="preserve"> </w:t>
+      </w:r>
+      <w:r>
+        <w:rPr>
+          <w:b/>
+        </w:rPr>
+        <w:t xml:space="preserve">Revisão em 14/06/2026 (OR → PR):</w:t>
+      </w:r>
+      <w:r>
+        <w:t xml:space="preserve"> </w:t>
+      </w:r>
+      <w:r>
+        <w:t xml:space="preserve">medida de efeito do Modelo 4 e dos modelos preditivos A/B/C migrada de Odds Ratio para</w:t>
+      </w:r>
+      <w:r>
+        <w:t xml:space="preserve"> </w:t>
+      </w:r>
+      <w:r>
+        <w:rPr>
+          <w:b/>
+        </w:rPr>
+        <w:t xml:space="preserve">Razão de Prevalência</w:t>
+      </w:r>
+      <w:r>
+        <w:t xml:space="preserve"> </w:t>
+      </w:r>
+      <w:r>
+        <w:t xml:space="preserve">(Poisson robusto; Zou, 2004). As tabelas</w:t>
+      </w:r>
+      <w:r>
+        <w:t xml:space="preserve"> </w:t>
+      </w:r>
+      <w:r>
+        <w:rPr>
+          <w:rStyle w:val="VerbatimChar"/>
+        </w:rPr>
         <w:t xml:space="preserve">tab_modelo_{A,B,C}_*_OR.csv</w:t>
       </w:r>
       <w:r>
-        <w:t xml:space="preserve">,</w:t>
-      </w:r>
-      <w:r>
-        <w:t xml:space="preserve"> </w:t>
-      </w:r>
-      <w:r>
-        <w:rPr>
-          <w:rStyle w:val="VerbatimChar"/>
-        </w:rPr>
-        <w:t xml:space="preserve">tab_escore_pre_natal_*.csv</w:t>
-      </w:r>
-      <w:r>
-        <w:t xml:space="preserve">,</w:t>
-      </w:r>
-      <w:r>
-        <w:t xml:space="preserve"> </w:t>
-      </w:r>
-      <w:r>
-        <w:rPr>
-          <w:rStyle w:val="VerbatimChar"/>
-        </w:rPr>
-        <w:t xml:space="preserve">results/figures/fig_obj6_*</w:t>
-      </w:r>
-      <w:r>
-        <w:t xml:space="preserve">,</w:t>
-      </w:r>
-      <w:r>
-        <w:t xml:space="preserve"> </w:t>
-      </w:r>
-      <w:r>
-        <w:rPr>
-          <w:rStyle w:val="VerbatimChar"/>
-        </w:rPr>
-        <w:t xml:space="preserve">results/RELATORIO_RESULTADOS_MODELOS_PREDITIVOS.md</w:t>
-      </w:r>
-      <w:r>
-        <w:t xml:space="preserve">,</w:t>
-      </w:r>
-      <w:r>
-        <w:t xml:space="preserve"> </w:t>
-      </w:r>
-      <w:r>
-        <w:rPr>
-          <w:rStyle w:val="VerbatimChar"/>
-        </w:rPr>
-        <w:t xml:space="preserve">results/RELATORIO_MODELOS_PREDITIVOS_CESAREA.md</w:t>
-      </w:r>
-      <w:r>
-        <w:t xml:space="preserve">,</w:t>
-      </w:r>
-      <w:r>
-        <w:t xml:space="preserve"> </w:t>
-      </w:r>
-      <w:r>
-        <w:rPr>
-          <w:rStyle w:val="VerbatimChar"/>
-        </w:rPr>
-        <w:t xml:space="preserve">results/FERRAMENTA_CLINICA_ESCORE_PRE_NATAL.md</w:t>
-      </w:r>
-      <w:r>
-        <w:t xml:space="preserve">,</w:t>
-      </w:r>
-      <w:r>
-        <w:t xml:space="preserve"> </w:t>
-      </w:r>
-      <w:r>
-        <w:rPr>
-          <w:rStyle w:val="VerbatimChar"/>
-        </w:rPr>
-        <w:t xml:space="preserve">results/calculadora_risco_cesarea.html</w:t>
+        <w:t xml:space="preserve"> </w:t>
+      </w:r>
+      <w:r>
+        <w:t xml:space="preserve">foram substituídas por</w:t>
+      </w:r>
+      <w:r>
+        <w:t xml:space="preserve"> </w:t>
+      </w:r>
+      <w:r>
+        <w:rPr>
+          <w:rStyle w:val="VerbatimChar"/>
+        </w:rPr>
+        <w:t xml:space="preserve">tab_modelo_{A,B,C}_PR.csv</w:t>
+      </w:r>
+      <w:r>
+        <w:t xml:space="preserve">. Detalhes em</w:t>
+      </w:r>
+      <w:r>
+        <w:t xml:space="preserve"> </w:t>
+      </w:r>
+      <w:r>
+        <w:rPr>
+          <w:rStyle w:val="VerbatimChar"/>
+        </w:rPr>
+        <w:t xml:space="preserve">COMPARACAO_OR_vs_PR.md</w:t>
+      </w:r>
+      <w:r>
+        <w:t xml:space="preserve">.</w:t>
       </w:r>
     </w:p>
     <w:p>
@@ -307,7 +391,49 @@
         <w:t xml:space="preserve"> </w:t>
       </w:r>
       <w:r>
-        <w:t xml:space="preserve">Tabela 10 (Modelo 4) está numericamente perfeita — todos os OR, IC 95% e p-valores batem exatamente com o Relatorio Analise SPSS.md (linhas 123–135). Forest plot (</w:t>
+        <w:t xml:space="preserve">Tabela 10 (Modelo 4) — os OR do SPSS batem exatamente entre si (Relatorio Analise SPSS.md linhas 123–135 e docx).</w:t>
+      </w:r>
+      <w:r>
+        <w:t xml:space="preserve"> </w:t>
+      </w:r>
+      <w:r>
+        <w:rPr>
+          <w:b/>
+        </w:rPr>
+        <w:t xml:space="preserve">Porém, desde 14/06/2026 a medida adotada é a PR</w:t>
+      </w:r>
+      <w:r>
+        <w:t xml:space="preserve"> </w:t>
+      </w:r>
+      <w:r>
+        <w:t xml:space="preserve">(Poisson robusto): a Tabela 10 e a Figura 7 da dissertação devem reportar o PR de</w:t>
+      </w:r>
+      <w:r>
+        <w:t xml:space="preserve"> </w:t>
+      </w:r>
+      <w:r>
+        <w:rPr>
+          <w:rStyle w:val="VerbatimChar"/>
+        </w:rPr>
+        <w:t xml:space="preserve">tab10b_comparacao_modelo4_r_vs_spss.csv</w:t>
+      </w:r>
+      <w:r>
+        <w:t xml:space="preserve"> </w:t>
+      </w:r>
+      <w:r>
+        <w:t xml:space="preserve">(coluna</w:t>
+      </w:r>
+      <w:r>
+        <w:t xml:space="preserve"> </w:t>
+      </w:r>
+      <w:r>
+        <w:rPr>
+          <w:rStyle w:val="VerbatimChar"/>
+        </w:rPr>
+        <w:t xml:space="preserve">PR_R</w:t>
+      </w:r>
+      <w:r>
+        <w:t xml:space="preserve">), tratando os OR do SPSS como histórico. O forest plot principal (</w:t>
       </w:r>
       <w:r>
         <w:rPr>
@@ -316,7 +442,7 @@
         <w:t xml:space="preserve">fig_obj5_forest_plot_modelo4.png</w:t>
       </w:r>
       <w:r>
-        <w:t xml:space="preserve">) foi gerado e corresponde aos mesmos valores.</w:t>
+        <w:t xml:space="preserve">) já foi regerado em PR.</w:t>
       </w:r>
     </w:p>
     <w:p>
@@ -373,7 +499,22 @@
         <w:t xml:space="preserve"> </w:t>
       </w:r>
       <w:r>
-        <w:t xml:space="preserve">Todos os números de comorbidades (§4.2) e de regressão logística (§4.5) na redação têm origem rastreável e conferem com o Relatorio SPSS.</w:t>
+        <w:t xml:space="preserve">Todos os números de comorbidades (§4.2) e da análise multivariada (§4.5) na redação têm origem rastreável e conferem com a fonte.</w:t>
+      </w:r>
+      <w:r>
+        <w:t xml:space="preserve"> </w:t>
+      </w:r>
+      <w:r>
+        <w:rPr>
+          <w:b/>
+        </w:rPr>
+        <w:t xml:space="preserve">Atenção:</w:t>
+      </w:r>
+      <w:r>
+        <w:t xml:space="preserve"> </w:t>
+      </w:r>
+      <w:r>
+        <w:t xml:space="preserve">a §4.5 deve passar a citar PR (Poisson robusto), não OR da logística — ver documento de revisão da dissertação.</w:t>
       </w:r>
     </w:p>
     <w:p>
@@ -4788,7 +4929,100 @@
         <w:t xml:space="preserve"> </w:t>
       </w:r>
       <w:r>
-        <w:t xml:space="preserve">Tabela 10 está perfeita. Sem correções necessárias.</w:t>
+        <w:t xml:space="preserve">A Tabela 10 do SPSS está internamente consistente (todos os OR batem entre</w:t>
+      </w:r>
+      <w:r>
+        <w:t xml:space="preserve"> </w:t>
+      </w:r>
+      <w:r>
+        <w:rPr>
+          <w:rStyle w:val="VerbatimChar"/>
+        </w:rPr>
+        <w:t xml:space="preserve">Relatorio Analise SPSS.md</w:t>
+      </w:r>
+      <w:r>
+        <w:t xml:space="preserve"> </w:t>
+      </w:r>
+      <w:r>
+        <w:t xml:space="preserve">e o docx).</w:t>
+      </w:r>
+      <w:r>
+        <w:t xml:space="preserve"> </w:t>
+      </w:r>
+      <w:r>
+        <w:rPr>
+          <w:b/>
+        </w:rPr>
+        <w:t xml:space="preserve">Atenção (migração OR → PR, 14/06/2026):</w:t>
+      </w:r>
+      <w:r>
+        <w:t xml:space="preserve"> </w:t>
+      </w:r>
+      <w:r>
+        <w:t xml:space="preserve">estes OR são da regressão logística do SPSS e passaram a ser tratados como</w:t>
+      </w:r>
+      <w:r>
+        <w:t xml:space="preserve"> </w:t>
+      </w:r>
+      <w:r>
+        <w:rPr>
+          <w:b/>
+        </w:rPr>
+        <w:t xml:space="preserve">registro histórico</w:t>
+      </w:r>
+      <w:r>
+        <w:t xml:space="preserve">. A medida adotada na dissertação é agora a</w:t>
+      </w:r>
+      <w:r>
+        <w:t xml:space="preserve"> </w:t>
+      </w:r>
+      <w:r>
+        <w:rPr>
+          <w:b/>
+        </w:rPr>
+        <w:t xml:space="preserve">Razão de Prevalência (PR)</w:t>
+      </w:r>
+      <w:r>
+        <w:t xml:space="preserve">, estimada por Poisson robusto (Zou, 2004) — ver</w:t>
+      </w:r>
+      <w:r>
+        <w:t xml:space="preserve"> </w:t>
+      </w:r>
+      <w:r>
+        <w:rPr>
+          <w:rStyle w:val="VerbatimChar"/>
+        </w:rPr>
+        <w:t xml:space="preserve">tab10b_comparacao_modelo4_r_vs_spss.csv</w:t>
+      </w:r>
+      <w:r>
+        <w:t xml:space="preserve"> </w:t>
+      </w:r>
+      <w:r>
+        <w:t xml:space="preserve">(coluna</w:t>
+      </w:r>
+      <w:r>
+        <w:t xml:space="preserve"> </w:t>
+      </w:r>
+      <w:r>
+        <w:rPr>
+          <w:rStyle w:val="VerbatimChar"/>
+        </w:rPr>
+        <w:t xml:space="preserve">PR_R</w:t>
+      </w:r>
+      <w:r>
+        <w:t xml:space="preserve">) e</w:t>
+      </w:r>
+      <w:r>
+        <w:t xml:space="preserve"> </w:t>
+      </w:r>
+      <w:r>
+        <w:rPr>
+          <w:rStyle w:val="VerbatimChar"/>
+        </w:rPr>
+        <w:t xml:space="preserve">COMPARACAO_OR_vs_PR.md</w:t>
+      </w:r>
+      <w:r>
+        <w:t xml:space="preserve">. A Tabela 10 e a Figura 7 da dissertação devem reportar o PR, não estes OR.</w:t>
       </w:r>
     </w:p>
     <w:p>
@@ -5075,10 +5309,25 @@
         <w:rPr>
           <w:rStyle w:val="VerbatimChar"/>
         </w:rPr>
-        <w:t xml:space="preserve">tab_modelo_{A,B,C}_*_OR.csv</w:t>
-      </w:r>
-      <w:r>
-        <w:t xml:space="preserve">,</w:t>
+        <w:t xml:space="preserve">tab_modelo_{A,B,C}_*_PR.csv</w:t>
+      </w:r>
+      <w:r>
+        <w:t xml:space="preserve"> </w:t>
+      </w:r>
+      <w:r>
+        <w:t xml:space="preserve">(antes</w:t>
+      </w:r>
+      <w:r>
+        <w:t xml:space="preserve"> </w:t>
+      </w:r>
+      <w:r>
+        <w:rPr>
+          <w:rStyle w:val="VerbatimChar"/>
+        </w:rPr>
+        <w:t xml:space="preserve">_OR.csv</w:t>
+      </w:r>
+      <w:r>
+        <w:t xml:space="preserve">, removidos na migração de 14/06/2026),</w:t>
       </w:r>
       <w:r>
         <w:t xml:space="preserve"> </w:t>
@@ -5325,18 +5574,30 @@
               <w:jc w:val="left"/>
             </w:pPr>
             <w:r>
-              <w:t xml:space="preserve">Direção/magnitude dos OR</w:t>
-            </w:r>
-          </w:p>
-        </w:tc>
-        <w:tc>
-          <w:p>
-            <w:pPr>
-              <w:pStyle w:val="Compact"/>
-              <w:jc w:val="left"/>
-            </w:pPr>
-            <w:r>
-              <w:t xml:space="preserve">Clinicamente coerentes: cesárea prévia ~12,6; Robson 5 ~12,6; Robson 6/7/9 de 16 a 31; adolescentes OR &lt; 1 vs. adultas em todos os modelos</w:t>
+              <w:t xml:space="preserve">Direção/magnitude da medida de efeito (agora</w:t>
+            </w:r>
+            <w:r>
+              <w:t xml:space="preserve"> </w:t>
+            </w:r>
+            <w:r>
+              <w:rPr>
+                <w:b/>
+              </w:rPr>
+              <w:t xml:space="preserve">PR</w:t>
+            </w:r>
+            <w:r>
+              <w:t xml:space="preserve">)</w:t>
+            </w:r>
+          </w:p>
+        </w:tc>
+        <w:tc>
+          <w:p>
+            <w:pPr>
+              <w:pStyle w:val="Compact"/>
+              <w:jc w:val="left"/>
+            </w:pPr>
+            <w:r>
+              <w:t xml:space="preserve">Clinicamente coerentes: cesárea prévia PR ~2,2–2,3; Robson 5 PR ~2,4; Robson 6/7/9 PR ~2,4–2,6; adolescentes PR &lt; 1 vs. adultas em todos os modelos. Direção e significância idênticas às do OR; só a magnitude foi atenuada (desfecho de alta prevalência)</w:t>
             </w:r>
           </w:p>
         </w:tc>
@@ -5500,13 +5761,28 @@
         <w:t xml:space="preserve">miceforest</w:t>
       </w:r>
       <w:r>
-        <w:t xml:space="preserve">) dentro de ±0,002 na AUC. Os relatórios passam a citar os valores do R como canônicos. Os arquivos OR foram padronizados nos nomes do R (</w:t>
-      </w:r>
-      <w:r>
-        <w:rPr>
-          <w:rStyle w:val="VerbatimChar"/>
-        </w:rPr>
-        <w:t xml:space="preserve">tab_modelo_A_pre_natal_OR.csv</w:t>
+        <w:t xml:space="preserve">) dentro de ±0,002 na AUC. Os relatórios passam a citar os valores do R como canônicos. As tabelas de coeficientes foram migradas de OR para</w:t>
+      </w:r>
+      <w:r>
+        <w:t xml:space="preserve"> </w:t>
+      </w:r>
+      <w:r>
+        <w:rPr>
+          <w:b/>
+        </w:rPr>
+        <w:t xml:space="preserve">PR</w:t>
+      </w:r>
+      <w:r>
+        <w:t xml:space="preserve"> </w:t>
+      </w:r>
+      <w:r>
+        <w:t xml:space="preserve">em 14/06/2026 (</w:t>
+      </w:r>
+      <w:r>
+        <w:rPr>
+          <w:rStyle w:val="VerbatimChar"/>
+        </w:rPr>
+        <w:t xml:space="preserve">tab_modelo_A_pre_natal_PR.csv</w:t>
       </w:r>
       <w:r>
         <w:t xml:space="preserve">,</w:t>
@@ -5518,7 +5794,7 @@
         <w:rPr>
           <w:rStyle w:val="VerbatimChar"/>
         </w:rPr>
-        <w:t xml:space="preserve">tab_modelo_B_pre_parto_OR.csv</w:t>
+        <w:t xml:space="preserve">tab_modelo_B_pre_parto_PR.csv</w:t>
       </w:r>
       <w:r>
         <w:t xml:space="preserve">,</w:t>
@@ -5530,10 +5806,25 @@
         <w:rPr>
           <w:rStyle w:val="VerbatimChar"/>
         </w:rPr>
-        <w:t xml:space="preserve">tab_modelo_C_robson_OR.csv</w:t>
-      </w:r>
-      <w:r>
-        <w:t xml:space="preserve">); as duplicatas com nomes do Python foram removidas.</w:t>
+        <w:t xml:space="preserve">tab_modelo_C_robson_PR.csv</w:t>
+      </w:r>
+      <w:r>
+        <w:t xml:space="preserve">); as versões</w:t>
+      </w:r>
+      <w:r>
+        <w:t xml:space="preserve"> </w:t>
+      </w:r>
+      <w:r>
+        <w:rPr>
+          <w:rStyle w:val="VerbatimChar"/>
+        </w:rPr>
+        <w:t xml:space="preserve">_OR.csv</w:t>
+      </w:r>
+      <w:r>
+        <w:t xml:space="preserve"> </w:t>
+      </w:r>
+      <w:r>
+        <w:t xml:space="preserve">e as duplicatas com nomes do Python foram removidas.</w:t>
       </w:r>
     </w:p>
     <w:p>
@@ -5632,7 +5923,7 @@
         <w:t xml:space="preserve"> </w:t>
       </w:r>
       <w:r>
-        <w:t xml:space="preserve">por separação quase-perfeita; interpretar OR desses termos com cautela.</w:t>
+        <w:t xml:space="preserve">por separação quase-perfeita; interpretar o PR desses termos com cautela.</w:t>
       </w:r>
     </w:p>
     <w:p>

</xml_diff>

<commit_message>
docs: atualiza relatorios, tabelas e graficos do modelo 4 com PR e indicacoes de cesarea
</commit_message>
<xml_diff>
--- a/RELATORIO_REVISAO_NUMERICA.docx
+++ b/RELATORIO_REVISAO_NUMERICA.docx
@@ -65,7 +65,7 @@
         <w:t xml:space="preserve"> </w:t>
       </w:r>
       <w:r>
-        <w:t xml:space="preserve">10 de junho de 2026</w:t>
+        <w:t xml:space="preserve">17 de junho de 2026</w:t>
       </w:r>
       <w:r>
         <w:br/>
@@ -74,6 +74,30 @@
         <w:rPr>
           <w:b/>
         </w:rPr>
+        <w:t xml:space="preserve">Manuscrito mais recente revisado:</w:t>
+      </w:r>
+      <w:r>
+        <w:t xml:space="preserve"> </w:t>
+      </w:r>
+      <w:r>
+        <w:rPr>
+          <w:rStyle w:val="VerbatimChar"/>
+        </w:rPr>
+        <w:t xml:space="preserve">manuscript/Dissertacao16_06_2026.pdf</w:t>
+      </w:r>
+      <w:r>
+        <w:t xml:space="preserve"> </w:t>
+      </w:r>
+      <w:r>
+        <w:t xml:space="preserve">(16/06/2026)</w:t>
+      </w:r>
+      <w:r>
+        <w:br/>
+      </w:r>
+      <w:r>
+        <w:rPr>
+          <w:b/>
+        </w:rPr>
         <w:t xml:space="preserve">Arquivos revisados:</w:t>
       </w:r>
       <w:r>
@@ -354,6 +378,128 @@
       </w:r>
       <w:r>
         <w:t xml:space="preserve">.</w:t>
+      </w:r>
+    </w:p>
+    <w:p>
+      <w:pPr>
+        <w:pStyle w:val="BodyText"/>
+      </w:pPr>
+      <w:r>
+        <w:rPr>
+          <w:b/>
+        </w:rPr>
+        <w:t xml:space="preserve">Revisão em 17/06/2026 (coerência de tamanhos amostrais — manuscrito 16/06):</w:t>
+      </w:r>
+      <w:r>
+        <w:t xml:space="preserve"> </w:t>
+      </w:r>
+      <w:r>
+        <w:t xml:space="preserve">verificação dos N de todo o capítulo de Resultados contra a</w:t>
+      </w:r>
+      <w:r>
+        <w:t xml:space="preserve"> </w:t>
+      </w:r>
+      <w:r>
+        <w:rPr>
+          <w:b/>
+        </w:rPr>
+        <w:t xml:space="preserve">execução da coorte §3.3</w:t>
+      </w:r>
+      <w:r>
+        <w:t xml:space="preserve"> </w:t>
+      </w:r>
+      <w:r>
+        <w:t xml:space="preserve">e os</w:t>
+      </w:r>
+      <w:r>
+        <w:t xml:space="preserve"> </w:t>
+      </w:r>
+      <w:r>
+        <w:rPr>
+          <w:b/>
+        </w:rPr>
+        <w:t xml:space="preserve">CSVs gerados pelos scripts</w:t>
+      </w:r>
+      <w:r>
+        <w:t xml:space="preserve">. Resultado em §0 (abaixo). Método: o ambiente atual</w:t>
+      </w:r>
+      <w:r>
+        <w:t xml:space="preserve"> </w:t>
+      </w:r>
+      <w:r>
+        <w:rPr>
+          <w:b/>
+        </w:rPr>
+        <w:t xml:space="preserve">não tem R</w:t>
+      </w:r>
+      <w:r>
+        <w:t xml:space="preserve">; a coorte §3.3 foi reproduzida por uma réplica em Python do</w:t>
+      </w:r>
+      <w:r>
+        <w:t xml:space="preserve"> </w:t>
+      </w:r>
+      <w:r>
+        <w:rPr>
+          <w:rStyle w:val="VerbatimChar"/>
+        </w:rPr>
+        <w:t xml:space="preserve">00_filtro_elegibilidade.R</w:t>
+      </w:r>
+      <w:r>
+        <w:t xml:space="preserve"> </w:t>
+      </w:r>
+      <w:r>
+        <w:t xml:space="preserve">que</w:t>
+      </w:r>
+      <w:r>
+        <w:t xml:space="preserve"> </w:t>
+      </w:r>
+      <w:r>
+        <w:rPr>
+          <w:b/>
+        </w:rPr>
+        <w:t xml:space="preserve">reproduz N = 6.650 exatamente</w:t>
+      </w:r>
+      <w:r>
+        <w:t xml:space="preserve"> </w:t>
+      </w:r>
+      <w:r>
+        <w:t xml:space="preserve">(538 / 829 / 5.283) e</w:t>
+      </w:r>
+      <w:r>
+        <w:t xml:space="preserve"> </w:t>
+      </w:r>
+      <w:r>
+        <w:rPr>
+          <w:b/>
+        </w:rPr>
+        <w:t xml:space="preserve">bate com os CSVs versionados</w:t>
+      </w:r>
+      <w:r>
+        <w:t xml:space="preserve"> </w:t>
+      </w:r>
+      <w:r>
+        <w:t xml:space="preserve">(</w:t>
+      </w:r>
+      <w:r>
+        <w:rPr>
+          <w:rStyle w:val="VerbatimChar"/>
+        </w:rPr>
+        <w:t xml:space="preserve">tab04_vias_parto_geral.csv</w:t>
+      </w:r>
+      <w:r>
+        <w:t xml:space="preserve">,</w:t>
+      </w:r>
+      <w:r>
+        <w:t xml:space="preserve"> </w:t>
+      </w:r>
+      <w:r>
+        <w:rPr>
+          <w:rStyle w:val="VerbatimChar"/>
+        </w:rPr>
+        <w:t xml:space="preserve">tab06_taxa_cesarea_robson.csv</w:t>
+      </w:r>
+      <w:r>
+        <w:t xml:space="preserve">) gerados pelo pipeline R. Nada foi estimado ou inventado: cada número abaixo foi recomputado a partir do dado bruto ou lido de um CSV de saída do script.</w:t>
       </w:r>
     </w:p>
     <w:p>
@@ -367,11 +513,766 @@
       <w:pPr>
         <w:pStyle w:val="Heading2"/>
       </w:pPr>
-      <w:bookmarkStart w:id="21" w:name="sumário-executivo"/>
-      <w:r>
-        <w:t xml:space="preserve">Sumário Executivo</w:t>
+      <w:bookmarkStart w:id="21" w:name="Xcf50c72950fb5b009fd878a2ca8159fa06178b5"/>
+      <w:r>
+        <w:t xml:space="preserve">0. Coerência dos tamanhos amostrais (manuscrito 16/06 — verificação por execução)</w:t>
       </w:r>
       <w:bookmarkEnd w:id="21"/>
+    </w:p>
+    <w:p>
+      <w:pPr>
+        <w:pStyle w:val="Heading3"/>
+      </w:pPr>
+      <w:bookmarkStart w:id="22" w:name="X2fafe24efeaf155235a19ff12a8a9d4d103bea7"/>
+      <w:r>
+        <w:t xml:space="preserve">0.1 Verificado e COERENTE (recomputado da coorte §3.3 / CSVs dos scripts)</w:t>
+      </w:r>
+      <w:bookmarkEnd w:id="22"/>
+    </w:p>
+    <w:p>
+      <w:pPr>
+        <w:pStyle w:val="FirstParagraph"/>
+      </w:pPr>
+      <w:r>
+        <w:t xml:space="preserve">Todos os itens abaixo foram recomputados e</w:t>
+      </w:r>
+      <w:r>
+        <w:t xml:space="preserve"> </w:t>
+      </w:r>
+      <w:r>
+        <w:rPr>
+          <w:b/>
+        </w:rPr>
+        <w:t xml:space="preserve">conferem exatamente</w:t>
+      </w:r>
+      <w:r>
+        <w:t xml:space="preserve"> </w:t>
+      </w:r>
+      <w:r>
+        <w:t xml:space="preserve">com o manuscrito:</w:t>
+      </w:r>
+    </w:p>
+    <w:tbl>
+      <w:tblPr>
+        <w:tblStyle w:val="Table"/>
+        <w:tblW w:type="pct" w:w="5000.0"/>
+        <w:tblLook w:firstRow="1"/>
+      </w:tblPr>
+      <w:tblGrid>
+        <w:gridCol w:w="1980"/>
+        <w:gridCol w:w="1980"/>
+        <w:gridCol w:w="1980"/>
+        <w:gridCol w:w="1980"/>
+      </w:tblGrid>
+      <w:tr>
+        <w:trPr>
+          <w:cnfStyle w:firstRow="1"/>
+        </w:trPr>
+        <w:tc>
+          <w:tcPr>
+            <w:tcBorders>
+              <w:bottom w:val="single"/>
+            </w:tcBorders>
+            <w:vAlign w:val="bottom"/>
+          </w:tcPr>
+          <w:p>
+            <w:pPr>
+              <w:pStyle w:val="Compact"/>
+              <w:jc w:val="left"/>
+            </w:pPr>
+            <w:r>
+              <w:t xml:space="preserve">Item</w:t>
+            </w:r>
+          </w:p>
+        </w:tc>
+        <w:tc>
+          <w:tcPr>
+            <w:tcBorders>
+              <w:bottom w:val="single"/>
+            </w:tcBorders>
+            <w:vAlign w:val="bottom"/>
+          </w:tcPr>
+          <w:p>
+            <w:pPr>
+              <w:pStyle w:val="Compact"/>
+              <w:jc w:val="left"/>
+            </w:pPr>
+            <w:r>
+              <w:t xml:space="preserve">Manuscrito 16/06</w:t>
+            </w:r>
+          </w:p>
+        </w:tc>
+        <w:tc>
+          <w:tcPr>
+            <w:tcBorders>
+              <w:bottom w:val="single"/>
+            </w:tcBorders>
+            <w:vAlign w:val="bottom"/>
+          </w:tcPr>
+          <w:p>
+            <w:pPr>
+              <w:pStyle w:val="Compact"/>
+              <w:jc w:val="left"/>
+            </w:pPr>
+            <w:r>
+              <w:t xml:space="preserve">Recomputado (§3.3)</w:t>
+            </w:r>
+          </w:p>
+        </w:tc>
+        <w:tc>
+          <w:tcPr>
+            <w:tcBorders>
+              <w:bottom w:val="single"/>
+            </w:tcBorders>
+            <w:vAlign w:val="bottom"/>
+          </w:tcPr>
+          <w:p>
+            <w:pPr>
+              <w:pStyle w:val="Compact"/>
+              <w:jc w:val="left"/>
+            </w:pPr>
+            <w:r>
+              <w:t xml:space="preserve">Situação</w:t>
+            </w:r>
+          </w:p>
+        </w:tc>
+      </w:tr>
+      <w:tr>
+        <w:tc>
+          <w:p>
+            <w:pPr>
+              <w:pStyle w:val="Compact"/>
+              <w:jc w:val="left"/>
+            </w:pPr>
+            <w:r>
+              <w:t xml:space="preserve">N final</w:t>
+            </w:r>
+          </w:p>
+        </w:tc>
+        <w:tc>
+          <w:p>
+            <w:pPr>
+              <w:pStyle w:val="Compact"/>
+              <w:jc w:val="left"/>
+            </w:pPr>
+            <w:r>
+              <w:t xml:space="preserve">6.650</w:t>
+            </w:r>
+          </w:p>
+        </w:tc>
+        <w:tc>
+          <w:p>
+            <w:pPr>
+              <w:pStyle w:val="Compact"/>
+              <w:jc w:val="left"/>
+            </w:pPr>
+            <w:r>
+              <w:t xml:space="preserve">6.650</w:t>
+            </w:r>
+          </w:p>
+        </w:tc>
+        <w:tc>
+          <w:p>
+            <w:pPr>
+              <w:pStyle w:val="Compact"/>
+              <w:jc w:val="left"/>
+            </w:pPr>
+            <w:r>
+              <w:t xml:space="preserve">✓</w:t>
+            </w:r>
+          </w:p>
+        </w:tc>
+      </w:tr>
+      <w:tr>
+        <w:tc>
+          <w:p>
+            <w:pPr>
+              <w:pStyle w:val="Compact"/>
+              <w:jc w:val="left"/>
+            </w:pPr>
+            <w:r>
+              <w:t xml:space="preserve">Precoces / Tardias / Adultas</w:t>
+            </w:r>
+          </w:p>
+        </w:tc>
+        <w:tc>
+          <w:p>
+            <w:pPr>
+              <w:pStyle w:val="Compact"/>
+              <w:jc w:val="left"/>
+            </w:pPr>
+            <w:r>
+              <w:t xml:space="preserve">538 / 829 / 5.283</w:t>
+            </w:r>
+          </w:p>
+        </w:tc>
+        <w:tc>
+          <w:p>
+            <w:pPr>
+              <w:pStyle w:val="Compact"/>
+              <w:jc w:val="left"/>
+            </w:pPr>
+            <w:r>
+              <w:t xml:space="preserve">538 / 829 / 5.283</w:t>
+            </w:r>
+          </w:p>
+        </w:tc>
+        <w:tc>
+          <w:p>
+            <w:pPr>
+              <w:pStyle w:val="Compact"/>
+              <w:jc w:val="left"/>
+            </w:pPr>
+            <w:r>
+              <w:t xml:space="preserve">✓</w:t>
+            </w:r>
+          </w:p>
+        </w:tc>
+      </w:tr>
+      <w:tr>
+        <w:tc>
+          <w:p>
+            <w:pPr>
+              <w:pStyle w:val="Compact"/>
+              <w:jc w:val="left"/>
+            </w:pPr>
+            <w:r>
+              <w:t xml:space="preserve">Adolescentes (total)</w:t>
+            </w:r>
+          </w:p>
+        </w:tc>
+        <w:tc>
+          <w:p>
+            <w:pPr>
+              <w:pStyle w:val="Compact"/>
+              <w:jc w:val="left"/>
+            </w:pPr>
+            <w:r>
+              <w:t xml:space="preserve">1.367</w:t>
+            </w:r>
+          </w:p>
+        </w:tc>
+        <w:tc>
+          <w:p>
+            <w:pPr>
+              <w:pStyle w:val="Compact"/>
+              <w:jc w:val="left"/>
+            </w:pPr>
+            <w:r>
+              <w:t xml:space="preserve">1.367</w:t>
+            </w:r>
+          </w:p>
+        </w:tc>
+        <w:tc>
+          <w:p>
+            <w:pPr>
+              <w:pStyle w:val="Compact"/>
+              <w:jc w:val="left"/>
+            </w:pPr>
+            <w:r>
+              <w:t xml:space="preserve">✓</w:t>
+            </w:r>
+          </w:p>
+        </w:tc>
+      </w:tr>
+      <w:tr>
+        <w:tc>
+          <w:p>
+            <w:pPr>
+              <w:pStyle w:val="Compact"/>
+              <w:jc w:val="left"/>
+            </w:pPr>
+            <w:r>
+              <w:t xml:space="preserve">Vias de parto — precoces (V/C/F)</w:t>
+            </w:r>
+          </w:p>
+        </w:tc>
+        <w:tc>
+          <w:p>
+            <w:pPr>
+              <w:pStyle w:val="Compact"/>
+              <w:jc w:val="left"/>
+            </w:pPr>
+            <w:r>
+              <w:t xml:space="preserve">238 / 166 / 134</w:t>
+            </w:r>
+          </w:p>
+        </w:tc>
+        <w:tc>
+          <w:p>
+            <w:pPr>
+              <w:pStyle w:val="Compact"/>
+              <w:jc w:val="left"/>
+            </w:pPr>
+            <w:r>
+              <w:t xml:space="preserve">238 / 166 / 134</w:t>
+            </w:r>
+          </w:p>
+        </w:tc>
+        <w:tc>
+          <w:p>
+            <w:pPr>
+              <w:pStyle w:val="Compact"/>
+              <w:jc w:val="left"/>
+            </w:pPr>
+            <w:r>
+              <w:t xml:space="preserve">✓</w:t>
+            </w:r>
+          </w:p>
+        </w:tc>
+      </w:tr>
+      <w:tr>
+        <w:tc>
+          <w:p>
+            <w:pPr>
+              <w:pStyle w:val="Compact"/>
+              <w:jc w:val="left"/>
+            </w:pPr>
+            <w:r>
+              <w:t xml:space="preserve">Vias de parto — tardias (V/C/F)</w:t>
+            </w:r>
+          </w:p>
+        </w:tc>
+        <w:tc>
+          <w:p>
+            <w:pPr>
+              <w:pStyle w:val="Compact"/>
+              <w:jc w:val="left"/>
+            </w:pPr>
+            <w:r>
+              <w:t xml:space="preserve">333 / 267 / 229</w:t>
+            </w:r>
+          </w:p>
+        </w:tc>
+        <w:tc>
+          <w:p>
+            <w:pPr>
+              <w:pStyle w:val="Compact"/>
+              <w:jc w:val="left"/>
+            </w:pPr>
+            <w:r>
+              <w:t xml:space="preserve">333 / 267 / 229</w:t>
+            </w:r>
+          </w:p>
+        </w:tc>
+        <w:tc>
+          <w:p>
+            <w:pPr>
+              <w:pStyle w:val="Compact"/>
+              <w:jc w:val="left"/>
+            </w:pPr>
+            <w:r>
+              <w:t xml:space="preserve">✓</w:t>
+            </w:r>
+          </w:p>
+        </w:tc>
+      </w:tr>
+      <w:tr>
+        <w:tc>
+          <w:p>
+            <w:pPr>
+              <w:pStyle w:val="Compact"/>
+              <w:jc w:val="left"/>
+            </w:pPr>
+            <w:r>
+              <w:t xml:space="preserve">Vias de parto — adultas (V/C/F)</w:t>
+            </w:r>
+          </w:p>
+        </w:tc>
+        <w:tc>
+          <w:p>
+            <w:pPr>
+              <w:pStyle w:val="Compact"/>
+              <w:jc w:val="left"/>
+            </w:pPr>
+            <w:r>
+              <w:t xml:space="preserve">1.426 / 3.313 / 544</w:t>
+            </w:r>
+          </w:p>
+        </w:tc>
+        <w:tc>
+          <w:p>
+            <w:pPr>
+              <w:pStyle w:val="Compact"/>
+              <w:jc w:val="left"/>
+            </w:pPr>
+            <w:r>
+              <w:t xml:space="preserve">1.426 / 3.313 / 544</w:t>
+            </w:r>
+          </w:p>
+        </w:tc>
+        <w:tc>
+          <w:p>
+            <w:pPr>
+              <w:pStyle w:val="Compact"/>
+              <w:jc w:val="left"/>
+            </w:pPr>
+            <w:r>
+              <w:t xml:space="preserve">✓</w:t>
+            </w:r>
+          </w:p>
+        </w:tc>
+      </w:tr>
+      <w:tr>
+        <w:tc>
+          <w:p>
+            <w:pPr>
+              <w:pStyle w:val="Compact"/>
+              <w:jc w:val="left"/>
+            </w:pPr>
+            <w:r>
+              <w:t xml:space="preserve">Vias de parto — total (V/C/F)</w:t>
+            </w:r>
+          </w:p>
+        </w:tc>
+        <w:tc>
+          <w:p>
+            <w:pPr>
+              <w:pStyle w:val="Compact"/>
+              <w:jc w:val="left"/>
+            </w:pPr>
+            <w:r>
+              <w:t xml:space="preserve">1.997 / 3.746 / 907</w:t>
+            </w:r>
+          </w:p>
+        </w:tc>
+        <w:tc>
+          <w:p>
+            <w:pPr>
+              <w:pStyle w:val="Compact"/>
+              <w:jc w:val="left"/>
+            </w:pPr>
+            <w:r>
+              <w:t xml:space="preserve">1.997 / 3.746 / 907</w:t>
+            </w:r>
+          </w:p>
+        </w:tc>
+        <w:tc>
+          <w:p>
+            <w:pPr>
+              <w:pStyle w:val="Compact"/>
+              <w:jc w:val="left"/>
+            </w:pPr>
+            <w:r>
+              <w:t xml:space="preserve">✓</w:t>
+            </w:r>
+          </w:p>
+        </w:tc>
+      </w:tr>
+      <w:tr>
+        <w:tc>
+          <w:p>
+            <w:pPr>
+              <w:pStyle w:val="Compact"/>
+              <w:jc w:val="left"/>
+            </w:pPr>
+            <w:r>
+              <w:t xml:space="preserve">Tamanhos dos grupos de Robson × faixa</w:t>
+            </w:r>
+          </w:p>
+        </w:tc>
+        <w:tc>
+          <w:p>
+            <w:pPr>
+              <w:pStyle w:val="Compact"/>
+              <w:jc w:val="left"/>
+            </w:pPr>
+            <w:r>
+              <w:t xml:space="preserve">(todos os 9 grupos)</w:t>
+            </w:r>
+          </w:p>
+        </w:tc>
+        <w:tc>
+          <w:p>
+            <w:pPr>
+              <w:pStyle w:val="Compact"/>
+              <w:jc w:val="left"/>
+            </w:pPr>
+            <w:r>
+              <w:t xml:space="preserve">idem</w:t>
+            </w:r>
+            <w:r>
+              <w:t xml:space="preserve"> </w:t>
+            </w:r>
+            <w:r>
+              <w:rPr>
+                <w:rStyle w:val="VerbatimChar"/>
+              </w:rPr>
+              <w:t xml:space="preserve">tab06</w:t>
+            </w:r>
+          </w:p>
+        </w:tc>
+        <w:tc>
+          <w:p>
+            <w:pPr>
+              <w:pStyle w:val="Compact"/>
+              <w:jc w:val="left"/>
+            </w:pPr>
+            <w:r>
+              <w:t xml:space="preserve">✓ (14/14 células conferidas)</w:t>
+            </w:r>
+          </w:p>
+        </w:tc>
+      </w:tr>
+      <w:tr>
+        <w:tc>
+          <w:p>
+            <w:pPr>
+              <w:pStyle w:val="Compact"/>
+              <w:jc w:val="left"/>
+            </w:pPr>
+            <w:r>
+              <w:t xml:space="preserve">Taxas de cesárea por Robson × faixa</w:t>
+            </w:r>
+          </w:p>
+        </w:tc>
+        <w:tc>
+          <w:p>
+            <w:pPr>
+              <w:pStyle w:val="Compact"/>
+              <w:jc w:val="left"/>
+            </w:pPr>
+            <w:r>
+              <w:t xml:space="preserve">(todas)</w:t>
+            </w:r>
+          </w:p>
+        </w:tc>
+        <w:tc>
+          <w:p>
+            <w:pPr>
+              <w:pStyle w:val="Compact"/>
+              <w:jc w:val="left"/>
+            </w:pPr>
+            <w:r>
+              <w:t xml:space="preserve">idem</w:t>
+            </w:r>
+            <w:r>
+              <w:t xml:space="preserve"> </w:t>
+            </w:r>
+            <w:r>
+              <w:rPr>
+                <w:rStyle w:val="VerbatimChar"/>
+              </w:rPr>
+              <w:t xml:space="preserve">tab06</w:t>
+            </w:r>
+          </w:p>
+        </w:tc>
+        <w:tc>
+          <w:p>
+            <w:pPr>
+              <w:pStyle w:val="Compact"/>
+              <w:jc w:val="left"/>
+            </w:pPr>
+            <w:r>
+              <w:t xml:space="preserve">✓</w:t>
+            </w:r>
+          </w:p>
+        </w:tc>
+      </w:tr>
+      <w:tr>
+        <w:tc>
+          <w:p>
+            <w:pPr>
+              <w:pStyle w:val="Compact"/>
+              <w:jc w:val="left"/>
+            </w:pPr>
+            <w:r>
+              <w:t xml:space="preserve">Grupos 4 e 5 (só adultas)</w:t>
+            </w:r>
+          </w:p>
+        </w:tc>
+        <w:tc>
+          <w:p>
+            <w:pPr>
+              <w:pStyle w:val="Compact"/>
+              <w:jc w:val="left"/>
+            </w:pPr>
+            <w:r>
+              <w:t xml:space="preserve">424 / 1.175</w:t>
+            </w:r>
+          </w:p>
+        </w:tc>
+        <w:tc>
+          <w:p>
+            <w:pPr>
+              <w:pStyle w:val="Compact"/>
+              <w:jc w:val="left"/>
+            </w:pPr>
+            <w:r>
+              <w:t xml:space="preserve">424 / 1.175</w:t>
+            </w:r>
+          </w:p>
+        </w:tc>
+        <w:tc>
+          <w:p>
+            <w:pPr>
+              <w:pStyle w:val="Compact"/>
+              <w:jc w:val="left"/>
+            </w:pPr>
+            <w:r>
+              <w:t xml:space="preserve">✓</w:t>
+            </w:r>
+          </w:p>
+        </w:tc>
+      </w:tr>
+      <w:tr>
+        <w:tc>
+          <w:p>
+            <w:pPr>
+              <w:pStyle w:val="Compact"/>
+              <w:jc w:val="left"/>
+            </w:pPr>
+            <w:r>
+              <w:t xml:space="preserve">Nº de consultas com dado</w:t>
+            </w:r>
+          </w:p>
+        </w:tc>
+        <w:tc>
+          <w:p>
+            <w:pPr>
+              <w:pStyle w:val="Compact"/>
+              <w:jc w:val="left"/>
+            </w:pPr>
+            <w:r>
+              <w:t xml:space="preserve">5.235</w:t>
+            </w:r>
+          </w:p>
+        </w:tc>
+        <w:tc>
+          <w:p>
+            <w:pPr>
+              <w:pStyle w:val="Compact"/>
+              <w:jc w:val="left"/>
+            </w:pPr>
+            <w:r>
+              <w:t xml:space="preserve">5.235</w:t>
+            </w:r>
+          </w:p>
+        </w:tc>
+        <w:tc>
+          <w:p>
+            <w:pPr>
+              <w:pStyle w:val="Compact"/>
+              <w:jc w:val="left"/>
+            </w:pPr>
+            <w:r>
+              <w:t xml:space="preserve">✓</w:t>
+            </w:r>
+          </w:p>
+        </w:tc>
+      </w:tr>
+      <w:tr>
+        <w:tc>
+          <w:p>
+            <w:pPr>
+              <w:pStyle w:val="Compact"/>
+              <w:jc w:val="left"/>
+            </w:pPr>
+            <w:r>
+              <w:t xml:space="preserve">Indicações de</w:t>
+            </w:r>
+            <w:r>
+              <w:t xml:space="preserve"> </w:t>
+            </w:r>
+            <w:r>
+              <w:rPr>
+                <w:b/>
+              </w:rPr>
+              <w:t xml:space="preserve">fórcipe</w:t>
+            </w:r>
+            <w:r>
+              <w:t xml:space="preserve"> </w:t>
+            </w:r>
+            <w:r>
+              <w:t xml:space="preserve">(denominadores)</w:t>
+            </w:r>
+          </w:p>
+        </w:tc>
+        <w:tc>
+          <w:p>
+            <w:pPr>
+              <w:pStyle w:val="Compact"/>
+              <w:jc w:val="left"/>
+            </w:pPr>
+            <w:r>
+              <w:t xml:space="preserve">363 (adol) / 544 (adultas)</w:t>
+            </w:r>
+          </w:p>
+        </w:tc>
+        <w:tc>
+          <w:p>
+            <w:pPr>
+              <w:pStyle w:val="Compact"/>
+              <w:jc w:val="left"/>
+            </w:pPr>
+            <w:r>
+              <w:t xml:space="preserve">363 / 544</w:t>
+            </w:r>
+          </w:p>
+        </w:tc>
+        <w:tc>
+          <w:p>
+            <w:pPr>
+              <w:pStyle w:val="Compact"/>
+              <w:jc w:val="left"/>
+            </w:pPr>
+            <w:r>
+              <w:t xml:space="preserve">✓</w:t>
+            </w:r>
+          </w:p>
+        </w:tc>
+      </w:tr>
+    </w:tbl>
+    <w:p>
+      <w:pPr>
+        <w:pStyle w:val="BlockText"/>
+      </w:pPr>
+      <w:r>
+        <w:t xml:space="preserve">Conclusão: o</w:t>
+      </w:r>
+      <w:r>
+        <w:t xml:space="preserve"> </w:t>
+      </w:r>
+      <w:r>
+        <w:t xml:space="preserve">“</w:t>
+      </w:r>
+      <w:r>
+        <w:t xml:space="preserve">esqueleto</w:t>
+      </w:r>
+      <w:r>
+        <w:t xml:space="preserve">”</w:t>
+      </w:r>
+      <w:r>
+        <w:t xml:space="preserve"> </w:t>
+      </w:r>
+      <w:r>
+        <w:t xml:space="preserve">de N do capítulo (coorte, vias de parto, Robson, consultas, fórcipe) está</w:t>
+      </w:r>
+      <w:r>
+        <w:t xml:space="preserve"> </w:t>
+      </w:r>
+      <w:r>
+        <w:rPr>
+          <w:b/>
+        </w:rPr>
+        <w:t xml:space="preserve">estável e rastreável</w:t>
+      </w:r>
+      <w:r>
+        <w:t xml:space="preserve"> </w:t>
+      </w:r>
+      <w:r>
+        <w:t xml:space="preserve">ao filtro §3.3 e aos CSVs dos scripts.</w:t>
+      </w:r>
+    </w:p>
+    <w:p>
+      <w:pPr>
+        <w:pStyle w:val="Heading3"/>
+      </w:pPr>
+      <w:bookmarkStart w:id="23" w:name="X97371596b5e65182f39581cd15f7fdafbc89b3d"/>
+      <w:r>
+        <w:t xml:space="preserve">0.2 INCONSISTÊNCIAS a corrigir (com a fonte correta indicada)</w:t>
+      </w:r>
+      <w:bookmarkEnd w:id="23"/>
     </w:p>
     <w:p>
       <w:pPr>
@@ -379,70 +1280,69 @@
           <w:ilvl w:val="0"/>
           <w:numId w:val="1001"/>
         </w:numPr>
-        <w:pStyle w:val="Compact"/>
-      </w:pPr>
-      <w:r>
-        <w:rPr>
-          <w:b/>
-        </w:rPr>
-        <w:t xml:space="preserve">OK:</w:t>
-      </w:r>
-      <w:r>
-        <w:t xml:space="preserve"> </w:t>
-      </w:r>
-      <w:r>
-        <w:t xml:space="preserve">Tabela 10 (Modelo 4) — os OR do SPSS batem exatamente entre si (Relatorio Analise SPSS.md linhas 123–135 e docx).</w:t>
-      </w:r>
-      <w:r>
-        <w:t xml:space="preserve"> </w:t>
-      </w:r>
-      <w:r>
-        <w:rPr>
-          <w:b/>
-        </w:rPr>
-        <w:t xml:space="preserve">Porém, desde 14/06/2026 a medida adotada é a PR</w:t>
-      </w:r>
-      <w:r>
-        <w:t xml:space="preserve"> </w:t>
-      </w:r>
-      <w:r>
-        <w:t xml:space="preserve">(Poisson robusto): a Tabela 10 e a Figura 7 da dissertação devem reportar o PR de</w:t>
-      </w:r>
-      <w:r>
-        <w:t xml:space="preserve"> </w:t>
-      </w:r>
-      <w:r>
-        <w:rPr>
-          <w:rStyle w:val="VerbatimChar"/>
-        </w:rPr>
-        <w:t xml:space="preserve">tab10b_comparacao_modelo4_r_vs_spss.csv</w:t>
-      </w:r>
-      <w:r>
-        <w:t xml:space="preserve"> </w:t>
-      </w:r>
-      <w:r>
-        <w:t xml:space="preserve">(coluna</w:t>
-      </w:r>
-      <w:r>
-        <w:t xml:space="preserve"> </w:t>
-      </w:r>
-      <w:r>
-        <w:rPr>
-          <w:rStyle w:val="VerbatimChar"/>
-        </w:rPr>
-        <w:t xml:space="preserve">PR_R</w:t>
-      </w:r>
-      <w:r>
-        <w:t xml:space="preserve">), tratando os OR do SPSS como histórico. O forest plot principal (</w:t>
-      </w:r>
-      <w:r>
-        <w:rPr>
-          <w:rStyle w:val="VerbatimChar"/>
-        </w:rPr>
-        <w:t xml:space="preserve">fig_obj5_forest_plot_modelo4.png</w:t>
-      </w:r>
-      <w:r>
-        <w:t xml:space="preserve">) já foi regerado em PR.</w:t>
+      </w:pPr>
+      <w:r>
+        <w:rPr>
+          <w:b/>
+        </w:rPr>
+        <w:t xml:space="preserve">Resumo/Abstract — nº de adultas.</w:t>
+      </w:r>
+      <w:r>
+        <w:t xml:space="preserve"> </w:t>
+      </w:r>
+      <w:r>
+        <w:t xml:space="preserve">O resumo (PT e EN) diz adultas</w:t>
+      </w:r>
+      <w:r>
+        <w:t xml:space="preserve"> </w:t>
+      </w:r>
+      <w:r>
+        <w:rPr>
+          <w:b/>
+        </w:rPr>
+        <w:t xml:space="preserve">“</w:t>
+      </w:r>
+      <w:r>
+        <w:rPr>
+          <w:b/>
+        </w:rPr>
+        <w:t xml:space="preserve">n = 5.279 / 5,279</w:t>
+      </w:r>
+      <w:r>
+        <w:rPr>
+          <w:b/>
+        </w:rPr>
+        <w:t xml:space="preserve">”</w:t>
+      </w:r>
+      <w:r>
+        <w:t xml:space="preserve">, mas a coorte §3.3 e o próprio corpo dos Resultados dizem</w:t>
+      </w:r>
+      <w:r>
+        <w:t xml:space="preserve"> </w:t>
+      </w:r>
+      <w:r>
+        <w:rPr>
+          <w:b/>
+        </w:rPr>
+        <w:t xml:space="preserve">5.283</w:t>
+      </w:r>
+      <w:r>
+        <w:t xml:space="preserve">. Corrigir o resumo para</w:t>
+      </w:r>
+      <w:r>
+        <w:t xml:space="preserve"> </w:t>
+      </w:r>
+      <w:r>
+        <w:rPr>
+          <w:b/>
+        </w:rPr>
+        <w:t xml:space="preserve">5.283</w:t>
+      </w:r>
+      <w:r>
+        <w:t xml:space="preserve"> </w:t>
+      </w:r>
+      <w:r>
+        <w:t xml:space="preserve">(Δ = 4). Fonte: filtro §3.3 (5.283 adultas).</w:t>
       </w:r>
     </w:p>
     <w:p>
@@ -451,34 +1351,129 @@
           <w:ilvl w:val="0"/>
           <w:numId w:val="1001"/>
         </w:numPr>
-        <w:pStyle w:val="Compact"/>
-      </w:pPr>
-      <w:r>
-        <w:rPr>
-          <w:b/>
-        </w:rPr>
-        <w:t xml:space="preserve">OK:</w:t>
-      </w:r>
-      <w:r>
-        <w:t xml:space="preserve"> </w:t>
-      </w:r>
-      <w:r>
-        <w:t xml:space="preserve">Tabelas 5 e 6 são internamente consistentes — para cada célula,</w:t>
-      </w:r>
-      <w:r>
-        <w:t xml:space="preserve"> </w:t>
-      </w:r>
-      <w:r>
-        <w:rPr>
-          <w:rStyle w:val="VerbatimChar"/>
-        </w:rPr>
-        <w:t xml:space="preserve">n_cesárea / n_total</w:t>
-      </w:r>
-      <w:r>
-        <w:t xml:space="preserve"> </w:t>
-      </w:r>
-      <w:r>
-        <w:t xml:space="preserve">coincide com a taxa percentual da Tabela 6 (verificado em todos os 12 grupos com dados disponíveis).</w:t>
+      </w:pPr>
+      <w:r>
+        <w:rPr>
+          <w:b/>
+        </w:rPr>
+        <w:t xml:space="preserve">Seção 5.4 / Tabela 8 — denominadores de cesárea não batem com o resto da dissertação.</w:t>
+      </w:r>
+      <w:r>
+        <w:t xml:space="preserve"> </w:t>
+      </w:r>
+      <w:r>
+        <w:t xml:space="preserve">A Tabela 8 (indicações de cesárea) usa a extração da estatística: precoces 138 + tardias 227 =</w:t>
+      </w:r>
+      <w:r>
+        <w:t xml:space="preserve"> </w:t>
+      </w:r>
+      <w:r>
+        <w:rPr>
+          <w:b/>
+        </w:rPr>
+        <w:t xml:space="preserve">365 adolescentes</w:t>
+      </w:r>
+      <w:r>
+        <w:t xml:space="preserve"> </w:t>
+      </w:r>
+      <w:r>
+        <w:t xml:space="preserve">e</w:t>
+      </w:r>
+      <w:r>
+        <w:t xml:space="preserve"> </w:t>
+      </w:r>
+      <w:r>
+        <w:rPr>
+          <w:b/>
+        </w:rPr>
+        <w:t xml:space="preserve">3.228 adultas</w:t>
+      </w:r>
+      <w:r>
+        <w:t xml:space="preserve"> </w:t>
+      </w:r>
+      <w:r>
+        <w:t xml:space="preserve">(total 3.593). Mas a</w:t>
+      </w:r>
+      <w:r>
+        <w:t xml:space="preserve"> </w:t>
+      </w:r>
+      <w:r>
+        <w:rPr>
+          <w:b/>
+        </w:rPr>
+        <w:t xml:space="preserve">Tabela 4 (vias de parto) do mesmo manuscrito</w:t>
+      </w:r>
+      <w:r>
+        <w:t xml:space="preserve"> </w:t>
+      </w:r>
+      <w:r>
+        <w:t xml:space="preserve">— e a coorte §3.3 — têm</w:t>
+      </w:r>
+      <w:r>
+        <w:t xml:space="preserve"> </w:t>
+      </w:r>
+      <w:r>
+        <w:rPr>
+          <w:b/>
+        </w:rPr>
+        <w:t xml:space="preserve">433 cesáreas em adolescentes</w:t>
+      </w:r>
+      <w:r>
+        <w:t xml:space="preserve"> </w:t>
+      </w:r>
+      <w:r>
+        <w:t xml:space="preserve">(166 + 267),</w:t>
+      </w:r>
+      <w:r>
+        <w:t xml:space="preserve"> </w:t>
+      </w:r>
+      <w:r>
+        <w:rPr>
+          <w:b/>
+        </w:rPr>
+        <w:t xml:space="preserve">3.313 em adultas</w:t>
+      </w:r>
+      <w:r>
+        <w:t xml:space="preserve"> </w:t>
+      </w:r>
+      <w:r>
+        <w:t xml:space="preserve">e</w:t>
+      </w:r>
+      <w:r>
+        <w:t xml:space="preserve"> </w:t>
+      </w:r>
+      <w:r>
+        <w:rPr>
+          <w:b/>
+        </w:rPr>
+        <w:t xml:space="preserve">3.746 no total</w:t>
+      </w:r>
+      <w:r>
+        <w:t xml:space="preserve">. Ou seja, o número de cesáreas muda entre a Tabela 4 e a Tabela 8 (Δ: +68 adolescentes, +85 adultas, +153 no total). Os denominadores de</w:t>
+      </w:r>
+      <w:r>
+        <w:t xml:space="preserve"> </w:t>
+      </w:r>
+      <w:r>
+        <w:rPr>
+          <w:b/>
+        </w:rPr>
+        <w:t xml:space="preserve">fórcipe</w:t>
+      </w:r>
+      <w:r>
+        <w:t xml:space="preserve"> </w:t>
+      </w:r>
+      <w:r>
+        <w:t xml:space="preserve">(363 / 544), em contraste, batem com a coorte.</w:t>
+      </w:r>
+      <w:r>
+        <w:t xml:space="preserve"> </w:t>
+      </w:r>
+      <w:r>
+        <w:rPr>
+          <w:b/>
+        </w:rPr>
+        <w:t xml:space="preserve">Esta é a principal incoerência de tamanho amostral do manuscrito.</w:t>
       </w:r>
     </w:p>
     <w:p>
@@ -487,41 +1482,148 @@
           <w:ilvl w:val="0"/>
           <w:numId w:val="1001"/>
         </w:numPr>
-        <w:pStyle w:val="Compact"/>
-      </w:pPr>
-      <w:r>
-        <w:rPr>
-          <w:b/>
-        </w:rPr>
-        <w:t xml:space="preserve">OK:</w:t>
-      </w:r>
-      <w:r>
-        <w:t xml:space="preserve"> </w:t>
-      </w:r>
-      <w:r>
-        <w:t xml:space="preserve">Todos os números de comorbidades (§4.2) e da análise multivariada (§4.5) na redação têm origem rastreável e conferem com a fonte.</w:t>
-      </w:r>
-      <w:r>
-        <w:t xml:space="preserve"> </w:t>
-      </w:r>
-      <w:r>
-        <w:rPr>
-          <w:b/>
-        </w:rPr>
-        <w:t xml:space="preserve">Atenção:</w:t>
-      </w:r>
-      <w:r>
-        <w:t xml:space="preserve"> </w:t>
-      </w:r>
-      <w:r>
-        <w:t xml:space="preserve">a §4.5 deve passar a citar PR (Poisson robusto), não OR da logística — ver documento de revisão da dissertação.</w:t>
+      </w:pPr>
+      <w:r>
+        <w:rPr>
+          <w:b/>
+        </w:rPr>
+        <w:t xml:space="preserve">Tabela 8 — rodapé com terceiro valor.</w:t>
+      </w:r>
+      <w:r>
+        <w:t xml:space="preserve"> </w:t>
+      </w:r>
+      <w:r>
+        <w:t xml:space="preserve">O rodapé da Tabela 8 diz adultas</w:t>
+      </w:r>
+      <w:r>
+        <w:t xml:space="preserve"> </w:t>
+      </w:r>
+      <w:r>
+        <w:rPr>
+          <w:b/>
+        </w:rPr>
+        <w:t xml:space="preserve">“</w:t>
+      </w:r>
+      <w:r>
+        <w:rPr>
+          <w:b/>
+        </w:rPr>
+        <w:t xml:space="preserve">n = 3.338 cesáreas</w:t>
+      </w:r>
+      <w:r>
+        <w:rPr>
+          <w:b/>
+        </w:rPr>
+        <w:t xml:space="preserve">”</w:t>
+      </w:r>
+      <w:r>
+        <w:t xml:space="preserve">, que não bate nem com a coluna da própria tabela (</w:t>
+      </w:r>
+      <w:r>
+        <w:rPr>
+          <w:b/>
+        </w:rPr>
+        <w:t xml:space="preserve">3.228</w:t>
+      </w:r>
+      <w:r>
+        <w:t xml:space="preserve">) nem com a coorte (</w:t>
+      </w:r>
+      <w:r>
+        <w:rPr>
+          <w:b/>
+        </w:rPr>
+        <w:t xml:space="preserve">3.313</w:t>
+      </w:r>
+      <w:r>
+        <w:t xml:space="preserve">). É um erro de digitação e precisa ser corrigido.</w:t>
+      </w:r>
+    </w:p>
+    <w:p>
+      <w:pPr>
+        <w:pStyle w:val="Heading3"/>
+      </w:pPr>
+      <w:bookmarkStart w:id="24" w:name="X23a7f56997f4395c1e2f6cae6d64d4402e19753"/>
+      <w:r>
+        <w:t xml:space="preserve">0.3 DÚVIDA registrada (não resolvível sem decisão de vocês)</w:t>
+      </w:r>
+      <w:bookmarkEnd w:id="24"/>
+    </w:p>
+    <w:p>
+      <w:pPr>
+        <w:pStyle w:val="FirstParagraph"/>
+      </w:pPr>
+      <w:r>
+        <w:t xml:space="preserve">A extração de cesáreas da estatística usada na Seção 5.4 (</w:t>
+      </w:r>
+      <w:r>
+        <w:rPr>
+          <w:b/>
+        </w:rPr>
+        <w:t xml:space="preserve">total 3.593</w:t>
+      </w:r>
+      <w:r>
+        <w:t xml:space="preserve">)</w:t>
+      </w:r>
+      <w:r>
+        <w:t xml:space="preserve"> </w:t>
+      </w:r>
+      <w:r>
+        <w:rPr>
+          <w:b/>
+        </w:rPr>
+        <w:t xml:space="preserve">não é reproduzível</w:t>
+      </w:r>
+      <w:r>
+        <w:t xml:space="preserve"> </w:t>
+      </w:r>
+      <w:r>
+        <w:t xml:space="preserve">a partir da coorte §3.3 / dos scripts deste repositório (</w:t>
+      </w:r>
+      <w:r>
+        <w:rPr>
+          <w:b/>
+        </w:rPr>
+        <w:t xml:space="preserve">total 3.746</w:t>
+      </w:r>
+      <w:r>
+        <w:t xml:space="preserve">). A diferença de</w:t>
+      </w:r>
+      <w:r>
+        <w:t xml:space="preserve"> </w:t>
+      </w:r>
+      <w:r>
+        <w:rPr>
+          <w:b/>
+        </w:rPr>
+        <w:t xml:space="preserve">153 cesáreas</w:t>
+      </w:r>
+      <w:r>
+        <w:t xml:space="preserve"> </w:t>
+      </w:r>
+      <w:r>
+        <w:t xml:space="preserve">vem de critérios de filtragem distintos (a tabulação da estatística foi feita em ferramenta externa, sobre outra extração).</w:t>
+      </w:r>
+      <w:r>
+        <w:t xml:space="preserve"> </w:t>
+      </w:r>
+      <w:r>
+        <w:rPr>
+          <w:b/>
+        </w:rPr>
+        <w:t xml:space="preserve">Não inventei nenhum valor para conciliar.</w:t>
+      </w:r>
+      <w:r>
+        <w:t xml:space="preserve"> </w:t>
+      </w:r>
+      <w:r>
+        <w:t xml:space="preserve">Duas saídas possíveis, a decidir com a estatística/orientador:</w:t>
       </w:r>
     </w:p>
     <w:p>
       <w:pPr>
         <w:numPr>
           <w:ilvl w:val="0"/>
-          <w:numId w:val="1001"/>
+          <w:numId w:val="1002"/>
         </w:numPr>
         <w:pStyle w:val="Compact"/>
       </w:pPr>
@@ -529,20 +1631,32 @@
         <w:rPr>
           <w:b/>
         </w:rPr>
-        <w:t xml:space="preserve">CRÍTICO:</w:t>
-      </w:r>
-      <w:r>
-        <w:t xml:space="preserve"> </w:t>
-      </w:r>
-      <w:r>
-        <w:t xml:space="preserve">Existem quatro valores distintos de N total circulando nos documentos (6.646, 6.663, 6.830 e 8.300/8.724). Nenhuma tabela usa exatamente o mesmo N, e os cinco placeholders da redação ainda não foram preenchidos.</w:t>
+        <w:t xml:space="preserve">(a) Padronizar pela coorte §3.3 (recomendado para coerência interna):</w:t>
+      </w:r>
+      <w:r>
+        <w:t xml:space="preserve"> </w:t>
+      </w:r>
+      <w:r>
+        <w:t xml:space="preserve">usar</w:t>
+      </w:r>
+      <w:r>
+        <w:t xml:space="preserve"> </w:t>
+      </w:r>
+      <w:r>
+        <w:rPr>
+          <w:rStyle w:val="VerbatimChar"/>
+        </w:rPr>
+        <w:t xml:space="preserve">analysis/03_indicacoes_parto.R</w:t>
+      </w:r>
+      <w:r>
+        <w:t xml:space="preserve">, que recalcula as indicações de cesárea sobre os mesmos 6.650 casos (433 adol / 3.313 adultas / 3.746) — totalmente rastreável e coerente com a Tabela 4. O custo é abrir mão das categorias agregadas da estatística (que podem ser remapeadas no script).</w:t>
       </w:r>
     </w:p>
     <w:p>
       <w:pPr>
         <w:numPr>
           <w:ilvl w:val="0"/>
-          <w:numId w:val="1001"/>
+          <w:numId w:val="1002"/>
         </w:numPr>
         <w:pStyle w:val="Compact"/>
       </w:pPr>
@@ -550,181 +1664,66 @@
         <w:rPr>
           <w:b/>
         </w:rPr>
-        <w:t xml:space="preserve">IMPORTANTE:</w:t>
-      </w:r>
-      <w:r>
-        <w:t xml:space="preserve"> </w:t>
-      </w:r>
-      <w:r>
-        <w:t xml:space="preserve">CSVs derivados (</w:t>
-      </w:r>
-      <w:r>
-        <w:rPr>
-          <w:rStyle w:val="VerbatimChar"/>
-        </w:rPr>
-        <w:t xml:space="preserve">tab05/tab06_*.csv</w:t>
-      </w:r>
-      <w:r>
-        <w:t xml:space="preserve">) têm valores diferentes dos CSVs primários (</w:t>
-      </w:r>
-      <w:r>
-        <w:rPr>
-          <w:rStyle w:val="VerbatimChar"/>
-        </w:rPr>
-        <w:t xml:space="preserve">tab_obj2_*.csv</w:t>
-      </w:r>
-      <w:r>
-        <w:t xml:space="preserve">) em quatro células — as Tabelas 5–7 do docx foram construídas corretamente a partir dos primários, mas os derivados contêm um bug de recomputação.</w:t>
-      </w:r>
-    </w:p>
-    <w:p>
-      <w:pPr>
-        <w:numPr>
-          <w:ilvl w:val="0"/>
-          <w:numId w:val="1001"/>
-        </w:numPr>
-        <w:pStyle w:val="Compact"/>
-      </w:pPr>
-      <w:r>
-        <w:rPr>
-          <w:b/>
-        </w:rPr>
-        <w:t xml:space="preserve">IMPORTANTE:</w:t>
-      </w:r>
-      <w:r>
-        <w:t xml:space="preserve"> </w:t>
-      </w:r>
-      <w:r>
-        <w:t xml:space="preserve">Figuras 5 e 6 (indicações de cesárea e fórcipe) são citadas na redação §4.4 mas os arquivos PNG não existem em</w:t>
-      </w:r>
-      <w:r>
-        <w:t xml:space="preserve"> </w:t>
-      </w:r>
-      <w:r>
-        <w:rPr>
-          <w:rStyle w:val="VerbatimChar"/>
-        </w:rPr>
-        <w:t xml:space="preserve">results/figures/</w:t>
-      </w:r>
-      <w:r>
-        <w:t xml:space="preserve">. Figura 7 (forest plot) existe mas não é referenciada na redação.</w:t>
-      </w:r>
-    </w:p>
-    <w:p>
-      <w:pPr>
-        <w:numPr>
-          <w:ilvl w:val="0"/>
-          <w:numId w:val="1001"/>
-        </w:numPr>
-        <w:pStyle w:val="Compact"/>
-      </w:pPr>
-      <w:r>
-        <w:rPr>
-          <w:b/>
-        </w:rPr>
-        <w:t xml:space="preserve">NOVO (10/06/2026):</w:t>
-      </w:r>
-      <w:r>
-        <w:t xml:space="preserve"> </w:t>
-      </w:r>
-      <w:r>
-        <w:t xml:space="preserve">Acrescentada a estratégia de</w:t>
-      </w:r>
-      <w:r>
-        <w:t xml:space="preserve"> </w:t>
-      </w:r>
-      <w:r>
-        <w:rPr>
-          <w:b/>
-        </w:rPr>
-        <w:t xml:space="preserve">três modelos preditivos</w:t>
-      </w:r>
-      <w:r>
-        <w:t xml:space="preserve"> </w:t>
-      </w:r>
-      <w:r>
-        <w:t xml:space="preserve">(</w:t>
-      </w:r>
-      <w:r>
-        <w:rPr>
-          <w:rStyle w:val="VerbatimChar"/>
-        </w:rPr>
-        <w:t xml:space="preserve">analysis/06_modelos_preditivos_cesarea.R</w:t>
-      </w:r>
-      <w:r>
-        <w:t xml:space="preserve">). Coorte total N =</w:t>
-      </w:r>
-      <w:r>
-        <w:t xml:space="preserve"> </w:t>
-      </w:r>
-      <w:r>
-        <w:rPr>
-          <w:b/>
-        </w:rPr>
-        <w:t xml:space="preserve">6.650</w:t>
-      </w:r>
-      <w:r>
-        <w:t xml:space="preserve"> </w:t>
-      </w:r>
-      <w:r>
-        <w:t xml:space="preserve">(filtro §3.3 codificado em</w:t>
-      </w:r>
-      <w:r>
-        <w:t xml:space="preserve"> </w:t>
-      </w:r>
-      <w:r>
-        <w:rPr>
-          <w:rStyle w:val="VerbatimChar"/>
-        </w:rPr>
-        <w:t xml:space="preserve">00_filtro_elegibilidade.R</w:t>
-      </w:r>
-      <w:r>
-        <w:t xml:space="preserve">) — quinto valor de N em circulação, mas agora</w:t>
-      </w:r>
-      <w:r>
-        <w:t xml:space="preserve"> </w:t>
-      </w:r>
-      <w:r>
-        <w:rPr>
-          <w:b/>
-        </w:rPr>
-        <w:t xml:space="preserve">determinístico e versionado</w:t>
-      </w:r>
-      <w:r>
-        <w:t xml:space="preserve"> </w:t>
-      </w:r>
-      <w:r>
-        <w:t xml:space="preserve">(ver §1.1). O script R foi</w:t>
-      </w:r>
-      <w:r>
-        <w:t xml:space="preserve"> </w:t>
-      </w:r>
-      <w:r>
-        <w:rPr>
-          <w:b/>
-        </w:rPr>
-        <w:t xml:space="preserve">executado</w:t>
-      </w:r>
-      <w:r>
-        <w:t xml:space="preserve"> </w:t>
-      </w:r>
-      <w:r>
-        <w:t xml:space="preserve">e seus resultados</w:t>
-      </w:r>
-      <w:r>
-        <w:t xml:space="preserve"> </w:t>
-      </w:r>
-      <w:r>
-        <w:rPr>
-          <w:b/>
-        </w:rPr>
-        <w:t xml:space="preserve">conferem com a validação em Python</w:t>
-      </w:r>
-      <w:r>
-        <w:t xml:space="preserve"> </w:t>
-      </w:r>
-      <w:r>
-        <w:t xml:space="preserve">(≤ 0,002 na AUC); coeficientes clinicamente coerentes e tabelas/figuras consistentes (ver §1.14). Pendência remanescente: validação externa + curva de decisão antes de uso clínico da ferramenta derivada.</w:t>
+        <w:t xml:space="preserve">(b) Manter a tabulação da estatística:</w:t>
+      </w:r>
+      <w:r>
+        <w:t xml:space="preserve"> </w:t>
+      </w:r>
+      <w:r>
+        <w:t xml:space="preserve">então é preciso</w:t>
+      </w:r>
+      <w:r>
+        <w:t xml:space="preserve"> </w:t>
+      </w:r>
+      <w:r>
+        <w:rPr>
+          <w:b/>
+        </w:rPr>
+        <w:t xml:space="preserve">documentar o filtro dela</w:t>
+      </w:r>
+      <w:r>
+        <w:t xml:space="preserve"> </w:t>
+      </w:r>
+      <w:r>
+        <w:t xml:space="preserve">(por que 3.593 e não 3.746) e</w:t>
+      </w:r>
+      <w:r>
+        <w:t xml:space="preserve"> </w:t>
+      </w:r>
+      <w:r>
+        <w:rPr>
+          <w:b/>
+        </w:rPr>
+        <w:t xml:space="preserve">assumir explicitamente</w:t>
+      </w:r>
+      <w:r>
+        <w:t xml:space="preserve"> </w:t>
+      </w:r>
+      <w:r>
+        <w:t xml:space="preserve">no texto que a base de indicações difere da base das vias de parto. Sem essa documentação, a divergência fica sem rastreabilidade.</w:t>
+      </w:r>
+    </w:p>
+    <w:p>
+      <w:pPr>
+        <w:pStyle w:val="FirstParagraph"/>
+      </w:pPr>
+      <w:r>
+        <w:t xml:space="preserve">Enquanto não houver decisão, os denominadores de cesárea da Seção 5.4 permanecem</w:t>
+      </w:r>
+      <w:r>
+        <w:t xml:space="preserve"> </w:t>
+      </w:r>
+      <w:r>
+        <w:rPr>
+          <w:b/>
+        </w:rPr>
+        <w:t xml:space="preserve">inconsistentes</w:t>
+      </w:r>
+      <w:r>
+        <w:t xml:space="preserve"> </w:t>
+      </w:r>
+      <w:r>
+        <w:t xml:space="preserve">com a Tabela 4 e com a coorte §3.3.</w:t>
       </w:r>
     </w:p>
     <w:p>
@@ -738,21 +1737,530 @@
       <w:pPr>
         <w:pStyle w:val="Heading2"/>
       </w:pPr>
-      <w:bookmarkStart w:id="22" w:name="inconsistências-encontradas"/>
+      <w:bookmarkStart w:id="25" w:name="sumário-executivo"/>
+      <w:r>
+        <w:t xml:space="preserve">Sumário Executivo</w:t>
+      </w:r>
+      <w:bookmarkEnd w:id="25"/>
+    </w:p>
+    <w:p>
+      <w:pPr>
+        <w:numPr>
+          <w:ilvl w:val="0"/>
+          <w:numId w:val="1003"/>
+        </w:numPr>
+        <w:pStyle w:val="Compact"/>
+      </w:pPr>
+      <w:r>
+        <w:rPr>
+          <w:b/>
+        </w:rPr>
+        <w:t xml:space="preserve">OK:</w:t>
+      </w:r>
+      <w:r>
+        <w:t xml:space="preserve"> </w:t>
+      </w:r>
+      <w:r>
+        <w:t xml:space="preserve">Tabela 10 (Modelo 4) — os OR do SPSS batem exatamente entre si (Relatorio Analise SPSS.md linhas 123–135 e docx).</w:t>
+      </w:r>
+      <w:r>
+        <w:t xml:space="preserve"> </w:t>
+      </w:r>
+      <w:r>
+        <w:rPr>
+          <w:b/>
+        </w:rPr>
+        <w:t xml:space="preserve">Porém, desde 14/06/2026 a medida adotada é a PR</w:t>
+      </w:r>
+      <w:r>
+        <w:t xml:space="preserve"> </w:t>
+      </w:r>
+      <w:r>
+        <w:t xml:space="preserve">(Poisson robusto): a Tabela 10 e a Figura 7 da dissertação devem reportar o PR de</w:t>
+      </w:r>
+      <w:r>
+        <w:t xml:space="preserve"> </w:t>
+      </w:r>
+      <w:r>
+        <w:rPr>
+          <w:rStyle w:val="VerbatimChar"/>
+        </w:rPr>
+        <w:t xml:space="preserve">tab10b_comparacao_modelo4_r_vs_spss.csv</w:t>
+      </w:r>
+      <w:r>
+        <w:t xml:space="preserve"> </w:t>
+      </w:r>
+      <w:r>
+        <w:t xml:space="preserve">(coluna</w:t>
+      </w:r>
+      <w:r>
+        <w:t xml:space="preserve"> </w:t>
+      </w:r>
+      <w:r>
+        <w:rPr>
+          <w:rStyle w:val="VerbatimChar"/>
+        </w:rPr>
+        <w:t xml:space="preserve">PR_R</w:t>
+      </w:r>
+      <w:r>
+        <w:t xml:space="preserve">), tratando os OR do SPSS como histórico. O forest plot principal (</w:t>
+      </w:r>
+      <w:r>
+        <w:rPr>
+          <w:rStyle w:val="VerbatimChar"/>
+        </w:rPr>
+        <w:t xml:space="preserve">fig_obj5_forest_plot_modelo4.png</w:t>
+      </w:r>
+      <w:r>
+        <w:t xml:space="preserve">) já foi regerado em PR.</w:t>
+      </w:r>
+    </w:p>
+    <w:p>
+      <w:pPr>
+        <w:numPr>
+          <w:ilvl w:val="0"/>
+          <w:numId w:val="1003"/>
+        </w:numPr>
+        <w:pStyle w:val="Compact"/>
+      </w:pPr>
+      <w:r>
+        <w:rPr>
+          <w:b/>
+        </w:rPr>
+        <w:t xml:space="preserve">OK:</w:t>
+      </w:r>
+      <w:r>
+        <w:t xml:space="preserve"> </w:t>
+      </w:r>
+      <w:r>
+        <w:t xml:space="preserve">Tabelas 5 e 6 são internamente consistentes — para cada célula,</w:t>
+      </w:r>
+      <w:r>
+        <w:t xml:space="preserve"> </w:t>
+      </w:r>
+      <w:r>
+        <w:rPr>
+          <w:rStyle w:val="VerbatimChar"/>
+        </w:rPr>
+        <w:t xml:space="preserve">n_cesárea / n_total</w:t>
+      </w:r>
+      <w:r>
+        <w:t xml:space="preserve"> </w:t>
+      </w:r>
+      <w:r>
+        <w:t xml:space="preserve">coincide com a taxa percentual da Tabela 6 (verificado em todos os 12 grupos com dados disponíveis).</w:t>
+      </w:r>
+    </w:p>
+    <w:p>
+      <w:pPr>
+        <w:numPr>
+          <w:ilvl w:val="0"/>
+          <w:numId w:val="1003"/>
+        </w:numPr>
+        <w:pStyle w:val="Compact"/>
+      </w:pPr>
+      <w:r>
+        <w:rPr>
+          <w:b/>
+        </w:rPr>
+        <w:t xml:space="preserve">OK:</w:t>
+      </w:r>
+      <w:r>
+        <w:t xml:space="preserve"> </w:t>
+      </w:r>
+      <w:r>
+        <w:t xml:space="preserve">Todos os números de comorbidades (§4.2) e da análise multivariada (§4.5) na redação têm origem rastreável e conferem com a fonte.</w:t>
+      </w:r>
+      <w:r>
+        <w:t xml:space="preserve"> </w:t>
+      </w:r>
+      <w:r>
+        <w:rPr>
+          <w:b/>
+        </w:rPr>
+        <w:t xml:space="preserve">Atenção:</w:t>
+      </w:r>
+      <w:r>
+        <w:t xml:space="preserve"> </w:t>
+      </w:r>
+      <w:r>
+        <w:t xml:space="preserve">a §4.5 deve passar a citar PR (Poisson robusto), não OR da logística — ver documento de revisão da dissertação.</w:t>
+      </w:r>
+    </w:p>
+    <w:p>
+      <w:pPr>
+        <w:numPr>
+          <w:ilvl w:val="0"/>
+          <w:numId w:val="1003"/>
+        </w:numPr>
+        <w:pStyle w:val="Compact"/>
+      </w:pPr>
+      <w:r>
+        <w:rPr>
+          <w:b/>
+        </w:rPr>
+        <w:t xml:space="preserve">RESOLVIDO (17/06):</w:t>
+      </w:r>
+      <w:r>
+        <w:t xml:space="preserve"> </w:t>
+      </w:r>
+      <w:r>
+        <w:t xml:space="preserve">o N total convergiu para</w:t>
+      </w:r>
+      <w:r>
+        <w:t xml:space="preserve"> </w:t>
+      </w:r>
+      <w:r>
+        <w:rPr>
+          <w:b/>
+        </w:rPr>
+        <w:t xml:space="preserve">6.650</w:t>
+      </w:r>
+      <w:r>
+        <w:t xml:space="preserve"> </w:t>
+      </w:r>
+      <w:r>
+        <w:t xml:space="preserve">em todo o manuscrito 16/06, recomputado e validado contra o filtro §3.3 e os CSVs dos scripts (ver §0.1). Os valores antigos divergentes (6.646, 6.663, 6.830, 8.300/8.724) não aparecem mais no corpo dos Resultados.</w:t>
+      </w:r>
+    </w:p>
+    <w:p>
+      <w:pPr>
+        <w:numPr>
+          <w:ilvl w:val="0"/>
+          <w:numId w:val="1003"/>
+        </w:numPr>
+        <w:pStyle w:val="Compact"/>
+      </w:pPr>
+      <w:r>
+        <w:rPr>
+          <w:b/>
+        </w:rPr>
+        <w:t xml:space="preserve">CRÍTICO (coerência de N, 17/06):</w:t>
+      </w:r>
+      <w:r>
+        <w:t xml:space="preserve"> </w:t>
+      </w:r>
+      <w:r>
+        <w:t xml:space="preserve">a Seção 5.4 (indicações de cesárea, Tabela 8) usa</w:t>
+      </w:r>
+      <w:r>
+        <w:t xml:space="preserve"> </w:t>
+      </w:r>
+      <w:r>
+        <w:rPr>
+          <w:b/>
+        </w:rPr>
+        <w:t xml:space="preserve">365 / 3.228</w:t>
+      </w:r>
+      <w:r>
+        <w:t xml:space="preserve"> </w:t>
+      </w:r>
+      <w:r>
+        <w:t xml:space="preserve">cesáreas (extração da estatística), enquanto a Tabela 4 e a coorte §3.3 têm</w:t>
+      </w:r>
+      <w:r>
+        <w:t xml:space="preserve"> </w:t>
+      </w:r>
+      <w:r>
+        <w:rPr>
+          <w:b/>
+        </w:rPr>
+        <w:t xml:space="preserve">433 / 3.313</w:t>
+      </w:r>
+      <w:r>
+        <w:t xml:space="preserve"> </w:t>
+      </w:r>
+      <w:r>
+        <w:t xml:space="preserve">(total 3.746 vs 3.593). Há ainda um terceiro valor no rodapé (3.338). Além disso, o resumo cita adultas</w:t>
+      </w:r>
+      <w:r>
+        <w:t xml:space="preserve"> </w:t>
+      </w:r>
+      <w:r>
+        <w:rPr>
+          <w:b/>
+        </w:rPr>
+        <w:t xml:space="preserve">5.279</w:t>
+      </w:r>
+      <w:r>
+        <w:t xml:space="preserve"> </w:t>
+      </w:r>
+      <w:r>
+        <w:t xml:space="preserve">em vez de</w:t>
+      </w:r>
+      <w:r>
+        <w:t xml:space="preserve"> </w:t>
+      </w:r>
+      <w:r>
+        <w:rPr>
+          <w:b/>
+        </w:rPr>
+        <w:t xml:space="preserve">5.283</w:t>
+      </w:r>
+      <w:r>
+        <w:t xml:space="preserve">. Detalhes e fontes em</w:t>
+      </w:r>
+      <w:r>
+        <w:t xml:space="preserve"> </w:t>
+      </w:r>
+      <w:r>
+        <w:rPr>
+          <w:b/>
+        </w:rPr>
+        <w:t xml:space="preserve">§0.2/§0.3</w:t>
+      </w:r>
+      <w:r>
+        <w:t xml:space="preserve">.</w:t>
+      </w:r>
+    </w:p>
+    <w:p>
+      <w:pPr>
+        <w:numPr>
+          <w:ilvl w:val="0"/>
+          <w:numId w:val="1003"/>
+        </w:numPr>
+        <w:pStyle w:val="Compact"/>
+      </w:pPr>
+      <w:r>
+        <w:rPr>
+          <w:b/>
+        </w:rPr>
+        <w:t xml:space="preserve">IMPORTANTE:</w:t>
+      </w:r>
+      <w:r>
+        <w:t xml:space="preserve"> </w:t>
+      </w:r>
+      <w:r>
+        <w:t xml:space="preserve">CSVs derivados (</w:t>
+      </w:r>
+      <w:r>
+        <w:rPr>
+          <w:rStyle w:val="VerbatimChar"/>
+        </w:rPr>
+        <w:t xml:space="preserve">tab05/tab06_*.csv</w:t>
+      </w:r>
+      <w:r>
+        <w:t xml:space="preserve">) têm valores diferentes dos CSVs primários (</w:t>
+      </w:r>
+      <w:r>
+        <w:rPr>
+          <w:rStyle w:val="VerbatimChar"/>
+        </w:rPr>
+        <w:t xml:space="preserve">tab_obj2_*.csv</w:t>
+      </w:r>
+      <w:r>
+        <w:t xml:space="preserve">) em quatro células — as Tabelas 5–7 do docx foram construídas corretamente a partir dos primários, mas os derivados contêm um bug de recomputação.</w:t>
+      </w:r>
+    </w:p>
+    <w:p>
+      <w:pPr>
+        <w:numPr>
+          <w:ilvl w:val="0"/>
+          <w:numId w:val="1003"/>
+        </w:numPr>
+        <w:pStyle w:val="Compact"/>
+      </w:pPr>
+      <w:r>
+        <w:rPr>
+          <w:b/>
+        </w:rPr>
+        <w:t xml:space="preserve">RESOLVIDO (jun/2026):</w:t>
+      </w:r>
+      <w:r>
+        <w:t xml:space="preserve"> </w:t>
+      </w:r>
+      <w:r>
+        <w:t xml:space="preserve">as Figuras 5 e 6 (indicações de cesárea e fórcipe) foram geradas —</w:t>
+      </w:r>
+      <w:r>
+        <w:t xml:space="preserve"> </w:t>
+      </w:r>
+      <w:r>
+        <w:rPr>
+          <w:rStyle w:val="VerbatimChar"/>
+        </w:rPr>
+        <w:t xml:space="preserve">results/figures/fig_obj3_indicacoes_cesarea.png</w:t>
+      </w:r>
+      <w:r>
+        <w:t xml:space="preserve"> </w:t>
+      </w:r>
+      <w:r>
+        <w:t xml:space="preserve">e</w:t>
+      </w:r>
+      <w:r>
+        <w:t xml:space="preserve"> </w:t>
+      </w:r>
+      <w:r>
+        <w:rPr>
+          <w:rStyle w:val="VerbatimChar"/>
+        </w:rPr>
+        <w:t xml:space="preserve">fig_obj3_indicacoes_forcipe.png</w:t>
+      </w:r>
+      <w:r>
+        <w:t xml:space="preserve"> </w:t>
+      </w:r>
+      <w:r>
+        <w:t xml:space="preserve">— agora com a cesárea agrupada por</w:t>
+      </w:r>
+      <w:r>
+        <w:t xml:space="preserve"> </w:t>
+      </w:r>
+      <w:r>
+        <w:rPr>
+          <w:rStyle w:val="VerbatimChar"/>
+        </w:rPr>
+        <w:t xml:space="preserve">Indicacao_final</w:t>
+      </w:r>
+      <w:r>
+        <w:t xml:space="preserve"> </w:t>
+      </w:r>
+      <w:r>
+        <w:t xml:space="preserve">(ver documento de revisão da dissertação, §8). A Figura 7 (forest plot) existe e passou a ser referenciada (e está em PR).</w:t>
+      </w:r>
+    </w:p>
+    <w:p>
+      <w:pPr>
+        <w:numPr>
+          <w:ilvl w:val="0"/>
+          <w:numId w:val="1003"/>
+        </w:numPr>
+        <w:pStyle w:val="Compact"/>
+      </w:pPr>
+      <w:r>
+        <w:rPr>
+          <w:b/>
+        </w:rPr>
+        <w:t xml:space="preserve">NOVO (10/06/2026):</w:t>
+      </w:r>
+      <w:r>
+        <w:t xml:space="preserve"> </w:t>
+      </w:r>
+      <w:r>
+        <w:t xml:space="preserve">Acrescentada a estratégia de</w:t>
+      </w:r>
+      <w:r>
+        <w:t xml:space="preserve"> </w:t>
+      </w:r>
+      <w:r>
+        <w:rPr>
+          <w:b/>
+        </w:rPr>
+        <w:t xml:space="preserve">três modelos preditivos</w:t>
+      </w:r>
+      <w:r>
+        <w:t xml:space="preserve"> </w:t>
+      </w:r>
+      <w:r>
+        <w:t xml:space="preserve">(</w:t>
+      </w:r>
+      <w:r>
+        <w:rPr>
+          <w:rStyle w:val="VerbatimChar"/>
+        </w:rPr>
+        <w:t xml:space="preserve">analysis/06_modelos_preditivos_cesarea.R</w:t>
+      </w:r>
+      <w:r>
+        <w:t xml:space="preserve">). Coorte total N =</w:t>
+      </w:r>
+      <w:r>
+        <w:t xml:space="preserve"> </w:t>
+      </w:r>
+      <w:r>
+        <w:rPr>
+          <w:b/>
+        </w:rPr>
+        <w:t xml:space="preserve">6.650</w:t>
+      </w:r>
+      <w:r>
+        <w:t xml:space="preserve"> </w:t>
+      </w:r>
+      <w:r>
+        <w:t xml:space="preserve">(filtro §3.3 codificado em</w:t>
+      </w:r>
+      <w:r>
+        <w:t xml:space="preserve"> </w:t>
+      </w:r>
+      <w:r>
+        <w:rPr>
+          <w:rStyle w:val="VerbatimChar"/>
+        </w:rPr>
+        <w:t xml:space="preserve">00_filtro_elegibilidade.R</w:t>
+      </w:r>
+      <w:r>
+        <w:t xml:space="preserve">) — quinto valor de N em circulação, mas agora</w:t>
+      </w:r>
+      <w:r>
+        <w:t xml:space="preserve"> </w:t>
+      </w:r>
+      <w:r>
+        <w:rPr>
+          <w:b/>
+        </w:rPr>
+        <w:t xml:space="preserve">determinístico e versionado</w:t>
+      </w:r>
+      <w:r>
+        <w:t xml:space="preserve"> </w:t>
+      </w:r>
+      <w:r>
+        <w:t xml:space="preserve">(ver §1.1). O script R foi</w:t>
+      </w:r>
+      <w:r>
+        <w:t xml:space="preserve"> </w:t>
+      </w:r>
+      <w:r>
+        <w:rPr>
+          <w:b/>
+        </w:rPr>
+        <w:t xml:space="preserve">executado</w:t>
+      </w:r>
+      <w:r>
+        <w:t xml:space="preserve"> </w:t>
+      </w:r>
+      <w:r>
+        <w:t xml:space="preserve">e seus resultados</w:t>
+      </w:r>
+      <w:r>
+        <w:t xml:space="preserve"> </w:t>
+      </w:r>
+      <w:r>
+        <w:rPr>
+          <w:b/>
+        </w:rPr>
+        <w:t xml:space="preserve">conferem com a validação em Python</w:t>
+      </w:r>
+      <w:r>
+        <w:t xml:space="preserve"> </w:t>
+      </w:r>
+      <w:r>
+        <w:t xml:space="preserve">(≤ 0,002 na AUC); coeficientes clinicamente coerentes e tabelas/figuras consistentes (ver §1.14). Pendência remanescente: validação externa + curva de decisão antes de uso clínico da ferramenta derivada.</w:t>
+      </w:r>
+    </w:p>
+    <w:p>
+      <w:r>
+        <w:pict>
+          <v:rect style="width:0;height:1.5pt" o:hralign="center" o:hrstd="t" o:hr="t"/>
+        </w:pict>
+      </w:r>
+    </w:p>
+    <w:p>
+      <w:pPr>
+        <w:pStyle w:val="Heading2"/>
+      </w:pPr>
+      <w:bookmarkStart w:id="26" w:name="inconsistências-encontradas"/>
       <w:r>
         <w:t xml:space="preserve">1. Inconsistências Encontradas</w:t>
       </w:r>
-      <w:bookmarkEnd w:id="22"/>
+      <w:bookmarkEnd w:id="26"/>
     </w:p>
     <w:p>
       <w:pPr>
         <w:pStyle w:val="Heading3"/>
       </w:pPr>
-      <w:bookmarkStart w:id="23" w:name="Xc66dfeba36c3940b5c5429df661e01837608ad3"/>
+      <w:bookmarkStart w:id="27" w:name="Xc66dfeba36c3940b5c5429df661e01837608ad3"/>
       <w:r>
         <w:t xml:space="preserve">1.1 N total da amostra — quatro valores em circulação (CRÍTICO)</w:t>
       </w:r>
-      <w:bookmarkEnd w:id="23"/>
+      <w:bookmarkEnd w:id="27"/>
     </w:p>
     <w:p>
       <w:pPr>
@@ -1589,43 +3097,253 @@
         <w:rPr>
           <w:b/>
         </w:rPr>
-        <w:t xml:space="preserve">Correção sugerida:</w:t>
-      </w:r>
-      <w:r>
-        <w:t xml:space="preserve"> </w:t>
-      </w:r>
-      <w:r>
-        <w:t xml:space="preserve">Adotar</w:t>
-      </w:r>
-      <w:r>
-        <w:t xml:space="preserve"> </w:t>
-      </w:r>
-      <w:r>
-        <w:rPr>
-          <w:b/>
-        </w:rPr>
-        <w:t xml:space="preserve">6.663</w:t>
-      </w:r>
-      <w:r>
-        <w:t xml:space="preserve"> </w:t>
-      </w:r>
-      <w:r>
-        <w:t xml:space="preserve">como N definitivo das análises de via de parto (Tabelas 4–7), pois é o valor que soma os n de todos os grupos de Robson no docx e é internamente consistente com a soma das células das Tabelas 5–7. Adotar</w:t>
-      </w:r>
-      <w:r>
-        <w:t xml:space="preserve"> </w:t>
-      </w:r>
-      <w:r>
-        <w:rPr>
-          <w:b/>
-        </w:rPr>
-        <w:t xml:space="preserve">6.830</w:t>
-      </w:r>
-      <w:r>
-        <w:t xml:space="preserve"> </w:t>
-      </w:r>
-      <w:r>
-        <w:t xml:space="preserve">(ou o n exato que o SPSS usou) para as Tabelas 1–3 (sociodemografia, hábitos, comorbidades), com nota clara de que o denominador difere por incluir casos sem Robson/IG. Eliminar as referências a 8.300 e 8.724 no texto corrido ou explicar explicitamente que esses são os totais brutos pré-critérios. Os cinco placeholders ([N_TOTAL], [N_ADOL], [N_PREC], [N_TARD], [N_ADUL]) devem ser preenchidos com os valores da tabela de análise escolhida (ver Seção 3).</w:t>
+        <w:t xml:space="preserve">Correção sugerida (ATUALIZADA 17/06/2026):</w:t>
+      </w:r>
+      <w:r>
+        <w:t xml:space="preserve"> </w:t>
+      </w:r>
+      <w:r>
+        <w:t xml:space="preserve">a tabela acima reflete o estado</w:t>
+      </w:r>
+      <w:r>
+        <w:t xml:space="preserve"> </w:t>
+      </w:r>
+      <w:r>
+        <w:rPr>
+          <w:i/>
+        </w:rPr>
+        <w:t xml:space="preserve">anterior</w:t>
+      </w:r>
+      <w:r>
+        <w:t xml:space="preserve"> </w:t>
+      </w:r>
+      <w:r>
+        <w:t xml:space="preserve">dos documentos. No manuscrito</w:t>
+      </w:r>
+      <w:r>
+        <w:t xml:space="preserve"> </w:t>
+      </w:r>
+      <w:r>
+        <w:rPr>
+          <w:b/>
+        </w:rPr>
+        <w:t xml:space="preserve">16/06</w:t>
+      </w:r>
+      <w:r>
+        <w:t xml:space="preserve">, o N convergiu para</w:t>
+      </w:r>
+      <w:r>
+        <w:t xml:space="preserve"> </w:t>
+      </w:r>
+      <w:r>
+        <w:rPr>
+          <w:b/>
+        </w:rPr>
+        <w:t xml:space="preserve">6.650</w:t>
+      </w:r>
+      <w:r>
+        <w:t xml:space="preserve"> </w:t>
+      </w:r>
+      <w:r>
+        <w:t xml:space="preserve">(filtro §3.3) de forma consistente — ver §0.1, onde cada célula foi recomputada e validada.</w:t>
+      </w:r>
+      <w:r>
+        <w:t xml:space="preserve"> </w:t>
+      </w:r>
+      <w:r>
+        <w:rPr>
+          <w:b/>
+        </w:rPr>
+        <w:t xml:space="preserve">A fonte definitiva é o pipeline modular</w:t>
+      </w:r>
+      <w:r>
+        <w:rPr>
+          <w:b/>
+        </w:rPr>
+        <w:t xml:space="preserve"> </w:t>
+      </w:r>
+      <w:r>
+        <w:rPr>
+          <w:rStyle w:val="VerbatimChar"/>
+          <w:b/>
+        </w:rPr>
+        <w:t xml:space="preserve">analysis/00–06</w:t>
+      </w:r>
+      <w:r>
+        <w:rPr>
+          <w:b/>
+        </w:rPr>
+        <w:t xml:space="preserve"> </w:t>
+      </w:r>
+      <w:r>
+        <w:rPr>
+          <w:b/>
+        </w:rPr>
+        <w:t xml:space="preserve">(</w:t>
+      </w:r>
+      <w:r>
+        <w:rPr>
+          <w:rStyle w:val="VerbatimChar"/>
+          <w:b/>
+        </w:rPr>
+        <w:t xml:space="preserve">00_filtro_elegibilidade.R</w:t>
+      </w:r>
+      <w:r>
+        <w:rPr>
+          <w:b/>
+        </w:rPr>
+        <w:t xml:space="preserve">), N = 6.650 (538 / 829 / 5.283)</w:t>
+      </w:r>
+      <w:r>
+        <w:t xml:space="preserve">, versionado e testado. As Tabelas 4–7 do manuscrito 16/06 já batem com ele. Observações:</w:t>
+      </w:r>
+      <w:r>
+        <w:t xml:space="preserve"> </w:t>
+      </w:r>
+      <w:r>
+        <w:t xml:space="preserve">- O valor</w:t>
+      </w:r>
+      <w:r>
+        <w:t xml:space="preserve"> </w:t>
+      </w:r>
+      <w:r>
+        <w:rPr>
+          <w:b/>
+        </w:rPr>
+        <w:t xml:space="preserve">5.279</w:t>
+      </w:r>
+      <w:r>
+        <w:t xml:space="preserve"> </w:t>
+      </w:r>
+      <w:r>
+        <w:t xml:space="preserve">que aparece no</w:t>
+      </w:r>
+      <w:r>
+        <w:t xml:space="preserve"> </w:t>
+      </w:r>
+      <w:r>
+        <w:rPr>
+          <w:b/>
+        </w:rPr>
+        <w:t xml:space="preserve">resumo/abstract</w:t>
+      </w:r>
+      <w:r>
+        <w:t xml:space="preserve"> </w:t>
+      </w:r>
+      <w:r>
+        <w:t xml:space="preserve">não corresponde a 5.283 (§3.3) nem ao CSV atual</w:t>
+      </w:r>
+      <w:r>
+        <w:t xml:space="preserve"> </w:t>
+      </w:r>
+      <w:r>
+        <w:rPr>
+          <w:rStyle w:val="VerbatimChar"/>
+        </w:rPr>
+        <w:t xml:space="preserve">tab_obj2_vias_parto_geral.csv</w:t>
+      </w:r>
+      <w:r>
+        <w:t xml:space="preserve"> </w:t>
+      </w:r>
+      <w:r>
+        <w:t xml:space="preserve">(que hoje traz adultas 5.295 / total 6.663, fruto de uma extração anterior). Recomenda-se</w:t>
+      </w:r>
+      <w:r>
+        <w:t xml:space="preserve"> </w:t>
+      </w:r>
+      <w:r>
+        <w:rPr>
+          <w:b/>
+        </w:rPr>
+        <w:t xml:space="preserve">corrigir o resumo para 5.283</w:t>
+      </w:r>
+      <w:r>
+        <w:t xml:space="preserve"> </w:t>
+      </w:r>
+      <w:r>
+        <w:t xml:space="preserve">e, se ainda em uso,</w:t>
+      </w:r>
+      <w:r>
+        <w:t xml:space="preserve"> </w:t>
+      </w:r>
+      <w:r>
+        <w:rPr>
+          <w:b/>
+        </w:rPr>
+        <w:t xml:space="preserve">regenerar</w:t>
+      </w:r>
+      <w:r>
+        <w:rPr>
+          <w:b/>
+        </w:rPr>
+        <w:t xml:space="preserve"> </w:t>
+      </w:r>
+      <w:r>
+        <w:rPr>
+          <w:rStyle w:val="VerbatimChar"/>
+          <w:b/>
+        </w:rPr>
+        <w:t xml:space="preserve">tab_obj2_*</w:t>
+      </w:r>
+      <w:r>
+        <w:rPr>
+          <w:b/>
+        </w:rPr>
+        <w:t xml:space="preserve"> </w:t>
+      </w:r>
+      <w:r>
+        <w:rPr>
+          <w:b/>
+        </w:rPr>
+        <w:t xml:space="preserve">pelo pipeline §3.3</w:t>
+      </w:r>
+      <w:r>
+        <w:t xml:space="preserve"> </w:t>
+      </w:r>
+      <w:r>
+        <w:t xml:space="preserve">para eliminar o 6.663 residual.</w:t>
+      </w:r>
+      <w:r>
+        <w:t xml:space="preserve"> </w:t>
+      </w:r>
+      <w:r>
+        <w:t xml:space="preserve">- Para Tabelas 1–3 (sociodemografia, hábitos, comorbidades), manter o denominador §3.3 (6.650) e reportar por célula o</w:t>
+      </w:r>
+      <w:r>
+        <w:t xml:space="preserve"> </w:t>
+      </w:r>
+      <w:r>
+        <w:rPr>
+          <w:rStyle w:val="VerbatimChar"/>
+        </w:rPr>
+        <w:t xml:space="preserve">n</w:t>
+      </w:r>
+      <w:r>
+        <w:t xml:space="preserve"> </w:t>
+      </w:r>
+      <w:r>
+        <w:t xml:space="preserve">válido +</w:t>
+      </w:r>
+      <w:r>
+        <w:t xml:space="preserve"> </w:t>
+      </w:r>
+      <w:r>
+        <w:rPr>
+          <w:rStyle w:val="VerbatimChar"/>
+        </w:rPr>
+        <w:t xml:space="preserve">% ausente</w:t>
+      </w:r>
+      <w:r>
+        <w:t xml:space="preserve"> </w:t>
+      </w:r>
+      <w:r>
+        <w:t xml:space="preserve">quando houver dado faltante, em vez de adotar o N do SPSS (6.830).</w:t>
+      </w:r>
+      <w:r>
+        <w:t xml:space="preserve"> </w:t>
+      </w:r>
+      <w:r>
+        <w:t xml:space="preserve">- Eliminar do texto as referências a 8.300 / 8.724 (totais brutos pré-critérios) ou marcá-las explicitamente como pré-filtro.</w:t>
       </w:r>
     </w:p>
     <w:p>
@@ -1639,11 +3357,11 @@
       <w:pPr>
         <w:pStyle w:val="Heading3"/>
       </w:pPr>
-      <w:bookmarkStart w:id="24" w:name="X5834b152b96cc10b72666f79cbd33d9a4ee7bed"/>
+      <w:bookmarkStart w:id="28" w:name="X5834b152b96cc10b72666f79cbd33d9a4ee7bed"/>
       <w:r>
         <w:t xml:space="preserve">1.2 Discrepância entre CSVs primários e CSVs derivados (Tabelas 5–7)</w:t>
       </w:r>
-      <w:bookmarkEnd w:id="24"/>
+      <w:bookmarkEnd w:id="28"/>
     </w:p>
     <w:p>
       <w:pPr>
@@ -2117,11 +3835,11 @@
       <w:pPr>
         <w:pStyle w:val="Heading3"/>
       </w:pPr>
-      <w:bookmarkStart w:id="25" w:name="Xb45335f927c3f14321b2e1ad71ed428c852810b"/>
+      <w:bookmarkStart w:id="29" w:name="Xb45335f927c3f14321b2e1ad71ed428c852810b"/>
       <w:r>
         <w:t xml:space="preserve">1.3 Discrepância entre totais de Tabela 4 no docx e CSV primário</w:t>
       </w:r>
-      <w:bookmarkEnd w:id="25"/>
+      <w:bookmarkEnd w:id="29"/>
     </w:p>
     <w:p>
       <w:pPr>
@@ -2492,11 +4210,11 @@
       <w:pPr>
         <w:pStyle w:val="Heading3"/>
       </w:pPr>
-      <w:bookmarkStart w:id="26" w:name="dissertação-original-p-valor-de-corraça"/>
+      <w:bookmarkStart w:id="30" w:name="dissertação-original-p-valor-de-corraça"/>
       <w:r>
         <w:t xml:space="preserve">1.4 Dissertação original — p-valor de cor/raça</w:t>
       </w:r>
-      <w:bookmarkEnd w:id="26"/>
+      <w:bookmarkEnd w:id="30"/>
     </w:p>
     <w:p>
       <w:pPr>
@@ -2869,11 +4587,11 @@
       <w:pPr>
         <w:pStyle w:val="Heading3"/>
       </w:pPr>
-      <w:bookmarkStart w:id="27" w:name="X3b9dd0828b47bf3f4317eff57616ef33a0898e6"/>
+      <w:bookmarkStart w:id="31" w:name="X3b9dd0828b47bf3f4317eff57616ef33a0898e6"/>
       <w:r>
         <w:t xml:space="preserve">1.5 Dissertação original — incompatibilidade entre §154 e legendas das Tabelas 1–2</w:t>
       </w:r>
-      <w:bookmarkEnd w:id="27"/>
+      <w:bookmarkEnd w:id="31"/>
     </w:p>
     <w:p>
       <w:pPr>
@@ -2899,7 +4617,7 @@
       <w:pPr>
         <w:numPr>
           <w:ilvl w:val="0"/>
-          <w:numId w:val="1002"/>
+          <w:numId w:val="1004"/>
         </w:numPr>
         <w:pStyle w:val="Compact"/>
       </w:pPr>
@@ -2932,7 +4650,7 @@
       <w:pPr>
         <w:numPr>
           <w:ilvl w:val="0"/>
-          <w:numId w:val="1002"/>
+          <w:numId w:val="1004"/>
         </w:numPr>
         <w:pStyle w:val="Compact"/>
       </w:pPr>
@@ -2965,7 +4683,7 @@
       <w:pPr>
         <w:numPr>
           <w:ilvl w:val="0"/>
-          <w:numId w:val="1002"/>
+          <w:numId w:val="1004"/>
         </w:numPr>
         <w:pStyle w:val="Compact"/>
       </w:pPr>
@@ -3048,11 +4766,11 @@
       <w:pPr>
         <w:pStyle w:val="Heading3"/>
       </w:pPr>
-      <w:bookmarkStart w:id="28" w:name="Xc998e19f1beb531f5104fc3fe83c7e7430e9a6e"/>
+      <w:bookmarkStart w:id="32" w:name="Xc998e19f1beb531f5104fc3fe83c7e7430e9a6e"/>
       <w:r>
         <w:t xml:space="preserve">1.6 Redação §4.1.2 — percentual de cor/raça pode não representar todas as adolescentes</w:t>
       </w:r>
-      <w:bookmarkEnd w:id="28"/>
+      <w:bookmarkEnd w:id="32"/>
     </w:p>
     <w:p>
       <w:pPr>
@@ -3172,11 +4890,11 @@
       <w:pPr>
         <w:pStyle w:val="Heading3"/>
       </w:pPr>
-      <w:bookmarkStart w:id="29" w:name="Xfd1e3324d8dc0b66ab417b6b292a3e1e1f95157"/>
+      <w:bookmarkStart w:id="33" w:name="Xfd1e3324d8dc0b66ab417b6b292a3e1e1f95157"/>
       <w:r>
         <w:t xml:space="preserve">1.7 Tabela 4 docx vs SPSS — diferença de percentuais de vias de parto</w:t>
       </w:r>
-      <w:bookmarkEnd w:id="29"/>
+      <w:bookmarkEnd w:id="33"/>
     </w:p>
     <w:p>
       <w:pPr>
@@ -3633,11 +5351,11 @@
       <w:pPr>
         <w:pStyle w:val="Heading3"/>
       </w:pPr>
-      <w:bookmarkStart w:id="30" w:name="X4a29ad09edd02bad39442919b79bd888147c470"/>
+      <w:bookmarkStart w:id="34" w:name="X4a29ad09edd02bad39442919b79bd888147c470"/>
       <w:r>
         <w:t xml:space="preserve">1.8 Tabela 8 — cobertura muito baixa e desigual de ind_final para adolescentes</w:t>
       </w:r>
-      <w:bookmarkEnd w:id="30"/>
+      <w:bookmarkEnd w:id="34"/>
     </w:p>
     <w:p>
       <w:pPr>
@@ -3775,11 +5493,11 @@
       <w:pPr>
         <w:pStyle w:val="Heading3"/>
       </w:pPr>
-      <w:bookmarkStart w:id="31" w:name="X83ce683508834d417d4b559caa7f7d533f632a8"/>
+      <w:bookmarkStart w:id="35" w:name="X83ce683508834d417d4b559caa7f7d533f632a8"/>
       <w:r>
         <w:t xml:space="preserve">1.9 Tabela 9 — inteiramente ND (confirmado como limitação)</w:t>
       </w:r>
-      <w:bookmarkEnd w:id="31"/>
+      <w:bookmarkEnd w:id="35"/>
     </w:p>
     <w:p>
       <w:pPr>
@@ -3938,11 +5656,11 @@
       <w:pPr>
         <w:pStyle w:val="Heading3"/>
       </w:pPr>
-      <w:bookmarkStart w:id="32" w:name="Xe00ddab75ef206d946732b7ee4d9e551b551d16"/>
+      <w:bookmarkStart w:id="36" w:name="Xe00ddab75ef206d946732b7ee4d9e551b551d16"/>
       <w:r>
         <w:t xml:space="preserve">1.10 Figuras 5 e 6 — citadas na redação mas arquivos PNG inexistentes</w:t>
       </w:r>
-      <w:bookmarkEnd w:id="32"/>
+      <w:bookmarkEnd w:id="36"/>
     </w:p>
     <w:p>
       <w:pPr>
@@ -4122,11 +5840,11 @@
       <w:pPr>
         <w:pStyle w:val="Heading3"/>
       </w:pPr>
-      <w:bookmarkStart w:id="33" w:name="Xe5b38d69fe1e5d6013c809078753aac6a020b9e"/>
+      <w:bookmarkStart w:id="37" w:name="Xe5b38d69fe1e5d6013c809078753aac6a020b9e"/>
       <w:r>
         <w:t xml:space="preserve">1.11 Figura 7 (forest plot) — existe mas não é referenciada na redação</w:t>
       </w:r>
-      <w:bookmarkEnd w:id="33"/>
+      <w:bookmarkEnd w:id="37"/>
     </w:p>
     <w:p>
       <w:pPr>
@@ -4256,11 +5974,11 @@
       <w:pPr>
         <w:pStyle w:val="Heading3"/>
       </w:pPr>
-      <w:bookmarkStart w:id="34" w:name="Xc85eb833574c25da0143588705d8f1c76c1b874"/>
+      <w:bookmarkStart w:id="38" w:name="Xc85eb833574c25da0143588705d8f1c76c1b874"/>
       <w:r>
         <w:t xml:space="preserve">1.12 Modelo 4 — verificação dos OR e IC 95% (resultado: SEM ERROS)</w:t>
       </w:r>
-      <w:bookmarkEnd w:id="34"/>
+      <w:bookmarkEnd w:id="38"/>
     </w:p>
     <w:p>
       <w:pPr>
@@ -5036,11 +6754,11 @@
       <w:pPr>
         <w:pStyle w:val="Heading3"/>
       </w:pPr>
-      <w:bookmarkStart w:id="35" w:name="Xd2137982ac88d65ddd591d7b936e1389f97d595"/>
+      <w:bookmarkStart w:id="39" w:name="Xd2137982ac88d65ddd591d7b936e1389f97d595"/>
       <w:r>
         <w:t xml:space="preserve">1.13 Tabela 7 — arredondamento do p-valor do Grupo 3</w:t>
       </w:r>
-      <w:bookmarkEnd w:id="35"/>
+      <w:bookmarkEnd w:id="39"/>
     </w:p>
     <w:p>
       <w:pPr>
@@ -5262,11 +6980,11 @@
       <w:pPr>
         <w:pStyle w:val="Heading3"/>
       </w:pPr>
-      <w:bookmarkStart w:id="36" w:name="X285a5b34e6b5e0c541bd85328c209baa5a4f2f2"/>
+      <w:bookmarkStart w:id="40" w:name="X285a5b34e6b5e0c541bd85328c209baa5a4f2f2"/>
       <w:r>
         <w:t xml:space="preserve">1.14 Modelos preditivos de cesárea (NOVO — 10/06/2026)</w:t>
       </w:r>
-      <w:bookmarkEnd w:id="36"/>
+      <w:bookmarkEnd w:id="40"/>
     </w:p>
     <w:p>
       <w:pPr>
@@ -5684,7 +7402,7 @@
       <w:pPr>
         <w:numPr>
           <w:ilvl w:val="0"/>
-          <w:numId w:val="1003"/>
+          <w:numId w:val="1005"/>
         </w:numPr>
         <w:pStyle w:val="Compact"/>
       </w:pPr>
@@ -5831,7 +7549,7 @@
       <w:pPr>
         <w:numPr>
           <w:ilvl w:val="0"/>
-          <w:numId w:val="1003"/>
+          <w:numId w:val="1005"/>
         </w:numPr>
         <w:pStyle w:val="Compact"/>
       </w:pPr>
@@ -5879,7 +7597,7 @@
       <w:pPr>
         <w:numPr>
           <w:ilvl w:val="0"/>
-          <w:numId w:val="1003"/>
+          <w:numId w:val="1005"/>
         </w:numPr>
         <w:pStyle w:val="Compact"/>
       </w:pPr>
@@ -5930,7 +7648,7 @@
       <w:pPr>
         <w:numPr>
           <w:ilvl w:val="0"/>
-          <w:numId w:val="1003"/>
+          <w:numId w:val="1005"/>
         </w:numPr>
         <w:pStyle w:val="Compact"/>
       </w:pPr>
@@ -5951,7 +7669,7 @@
       <w:pPr>
         <w:numPr>
           <w:ilvl w:val="0"/>
-          <w:numId w:val="1003"/>
+          <w:numId w:val="1005"/>
         </w:numPr>
         <w:pStyle w:val="Compact"/>
       </w:pPr>
@@ -6011,21 +7729,21 @@
       <w:pPr>
         <w:pStyle w:val="Heading2"/>
       </w:pPr>
-      <w:bookmarkStart w:id="37" w:name="itens-em-branco-nd-e-placeholders"/>
+      <w:bookmarkStart w:id="41" w:name="itens-em-branco-nd-e-placeholders"/>
       <w:r>
         <w:t xml:space="preserve">2. Itens em Branco (ND e Placeholders)</w:t>
       </w:r>
-      <w:bookmarkEnd w:id="37"/>
+      <w:bookmarkEnd w:id="41"/>
     </w:p>
     <w:p>
       <w:pPr>
         <w:pStyle w:val="Heading3"/>
       </w:pPr>
-      <w:bookmarkStart w:id="38" w:name="Xd06dfb1679552e31459391b3b573570259831e4"/>
+      <w:bookmarkStart w:id="42" w:name="Xd06dfb1679552e31459391b3b573570259831e4"/>
       <w:r>
         <w:t xml:space="preserve">2.1 Cinco placeholders na redação — ação obrigatória</w:t>
       </w:r>
-      <w:bookmarkEnd w:id="38"/>
+      <w:bookmarkEnd w:id="42"/>
     </w:p>
     <w:p>
       <w:pPr>
@@ -6480,11 +8198,11 @@
       <w:pPr>
         <w:pStyle w:val="Heading3"/>
       </w:pPr>
-      <w:bookmarkStart w:id="39" w:name="tabela-9-todas-as-células-nd"/>
+      <w:bookmarkStart w:id="43" w:name="tabela-9-todas-as-células-nd"/>
       <w:r>
         <w:t xml:space="preserve">2.2 Tabela 9 — todas as células ND</w:t>
       </w:r>
-      <w:bookmarkEnd w:id="39"/>
+      <w:bookmarkEnd w:id="43"/>
     </w:p>
     <w:p>
       <w:pPr>
@@ -6608,11 +8326,11 @@
       <w:pPr>
         <w:pStyle w:val="Heading3"/>
       </w:pPr>
-      <w:bookmarkStart w:id="40" w:name="Xaf70eecc6a823d106a0aba11c379b8b68e219b5"/>
+      <w:bookmarkStart w:id="44" w:name="Xaf70eecc6a823d106a0aba11c379b8b68e219b5"/>
       <w:r>
         <w:t xml:space="preserve">2.3 Tabela 11 (desfechos neonatais) — CSV existe, não está no docx</w:t>
       </w:r>
-      <w:bookmarkEnd w:id="40"/>
+      <w:bookmarkEnd w:id="44"/>
     </w:p>
     <w:p>
       <w:pPr>
@@ -6698,294 +8416,21 @@
       <w:pPr>
         <w:pStyle w:val="Heading2"/>
       </w:pPr>
-      <w:bookmarkStart w:id="41" w:name="recomendações-finais"/>
+      <w:bookmarkStart w:id="45" w:name="recomendações-finais"/>
       <w:r>
         <w:t xml:space="preserve">3. Recomendações Finais</w:t>
       </w:r>
-      <w:bookmarkEnd w:id="41"/>
+      <w:bookmarkEnd w:id="45"/>
     </w:p>
     <w:p>
       <w:pPr>
         <w:pStyle w:val="Heading3"/>
       </w:pPr>
-      <w:bookmarkStart w:id="42" w:name="para-a-letícia"/>
+      <w:bookmarkStart w:id="46" w:name="para-a-letícia"/>
       <w:r>
         <w:t xml:space="preserve">Para a Letícia</w:t>
       </w:r>
-      <w:bookmarkEnd w:id="42"/>
-    </w:p>
-    <w:p>
-      <w:pPr>
-        <w:numPr>
-          <w:ilvl w:val="0"/>
-          <w:numId w:val="1004"/>
-        </w:numPr>
-      </w:pPr>
-      <w:r>
-        <w:rPr>
-          <w:b/>
-        </w:rPr>
-        <w:t xml:space="preserve">Decisão prioritária — o N:</w:t>
-      </w:r>
-      <w:r>
-        <w:t xml:space="preserve"> </w:t>
-      </w:r>
-      <w:r>
-        <w:t xml:space="preserve">Antes de colar qualquer tabela ou parágrafo no docx principal, definir com Eduardo qual N usar para as tabelas de análise (Tabelas 4–7): 6.646 (CSV primário de vias) ou 6.663 (CSV primário de taxa/Robson). Essa diferença de 17 casos precisa ser investigada e resolvida, não contornada. Uma vez definido, preencher os cinco placeholders.</w:t>
-      </w:r>
-    </w:p>
-    <w:p>
-      <w:pPr>
-        <w:numPr>
-          <w:ilvl w:val="0"/>
-          <w:numId w:val="1004"/>
-        </w:numPr>
-      </w:pPr>
-      <w:r>
-        <w:rPr>
-          <w:b/>
-        </w:rPr>
-        <w:t xml:space="preserve">Substituições no texto original da dissertação:</w:t>
-      </w:r>
-    </w:p>
-    <w:p>
-      <w:pPr>
-        <w:numPr>
-          <w:ilvl w:val="1"/>
-          <w:numId w:val="1005"/>
-        </w:numPr>
-        <w:pStyle w:val="Compact"/>
-      </w:pPr>
-      <w:r>
-        <w:t xml:space="preserve">§154: substituir</w:t>
-      </w:r>
-      <w:r>
-        <w:t xml:space="preserve"> </w:t>
-      </w:r>
-      <w:r>
-        <w:t xml:space="preserve">“</w:t>
-      </w:r>
-      <w:r>
-        <w:t xml:space="preserve">8.300 participantes, sendo 1.348 parturientes adolescentes e 6.952 adultas</w:t>
-      </w:r>
-      <w:r>
-        <w:t xml:space="preserve">”</w:t>
-      </w:r>
-      <w:r>
-        <w:t xml:space="preserve"> </w:t>
-      </w:r>
-      <w:r>
-        <w:t xml:space="preserve">pelos N definitivos.</w:t>
-      </w:r>
-    </w:p>
-    <w:p>
-      <w:pPr>
-        <w:numPr>
-          <w:ilvl w:val="1"/>
-          <w:numId w:val="1005"/>
-        </w:numPr>
-        <w:pStyle w:val="Compact"/>
-      </w:pPr>
-      <w:r>
-        <w:t xml:space="preserve">Legendas das Tabelas 1 e 2 originais: substituir</w:t>
-      </w:r>
-      <w:r>
-        <w:t xml:space="preserve"> </w:t>
-      </w:r>
-      <w:r>
-        <w:t xml:space="preserve">“</w:t>
-      </w:r>
-      <w:r>
-        <w:t xml:space="preserve">1.677 adolescentes e 7.047 adultas</w:t>
-      </w:r>
-      <w:r>
-        <w:t xml:space="preserve">”</w:t>
-      </w:r>
-      <w:r>
-        <w:t xml:space="preserve"> </w:t>
-      </w:r>
-      <w:r>
-        <w:t xml:space="preserve">pelos N definitivos.</w:t>
-      </w:r>
-    </w:p>
-    <w:p>
-      <w:pPr>
-        <w:numPr>
-          <w:ilvl w:val="1"/>
-          <w:numId w:val="1005"/>
-        </w:numPr>
-        <w:pStyle w:val="Compact"/>
-      </w:pPr>
-      <w:r>
-        <w:t xml:space="preserve">§160: substituir</w:t>
-      </w:r>
-      <w:r>
-        <w:t xml:space="preserve"> </w:t>
-      </w:r>
-      <w:r>
-        <w:t xml:space="preserve">“</w:t>
-      </w:r>
-      <w:r>
-        <w:t xml:space="preserve">p valor neste caso é de 0,06</w:t>
-      </w:r>
-      <w:r>
-        <w:t xml:space="preserve">”</w:t>
-      </w:r>
-      <w:r>
-        <w:t xml:space="preserve"> </w:t>
-      </w:r>
-      <w:r>
-        <w:t xml:space="preserve">por</w:t>
-      </w:r>
-      <w:r>
-        <w:t xml:space="preserve"> </w:t>
-      </w:r>
-      <w:r>
-        <w:t xml:space="preserve">“</w:t>
-      </w:r>
-      <w:r>
-        <w:t xml:space="preserve">p = 0,337</w:t>
-      </w:r>
-      <w:r>
-        <w:t xml:space="preserve">”</w:t>
-      </w:r>
-      <w:r>
-        <w:t xml:space="preserve">.</w:t>
-      </w:r>
-    </w:p>
-    <w:p>
-      <w:pPr>
-        <w:numPr>
-          <w:ilvl w:val="0"/>
-          <w:numId w:val="1004"/>
-        </w:numPr>
-      </w:pPr>
-      <w:r>
-        <w:rPr>
-          <w:b/>
-        </w:rPr>
-        <w:t xml:space="preserve">Decisão sobre a Tabela 9 e os desfechos neonatais:</w:t>
-      </w:r>
-      <w:r>
-        <w:t xml:space="preserve"> </w:t>
-      </w:r>
-      <w:r>
-        <w:t xml:space="preserve">São duas decisões independentes que determinam se a dissertação terá 10 ou 11 tabelas. Recomendo tomar essas decisões antes de montar o docx final.</w:t>
-      </w:r>
-    </w:p>
-    <w:p>
-      <w:pPr>
-        <w:numPr>
-          <w:ilvl w:val="0"/>
-          <w:numId w:val="1004"/>
-        </w:numPr>
-      </w:pPr>
-      <w:r>
-        <w:rPr>
-          <w:b/>
-        </w:rPr>
-        <w:t xml:space="preserve">Verificar o valor de 56,3% (cor/raça):</w:t>
-      </w:r>
-      <w:r>
-        <w:t xml:space="preserve"> </w:t>
-      </w:r>
-      <w:r>
-        <w:t xml:space="preserve">Confirmar se o SPSS reporta exatamente 56,3% para o grupo adolescente combinado ou se o valor preciso é diferente. Ajustar §4.1.2 conforme necessário.</w:t>
-      </w:r>
-    </w:p>
-    <w:p>
-      <w:pPr>
-        <w:numPr>
-          <w:ilvl w:val="0"/>
-          <w:numId w:val="1004"/>
-        </w:numPr>
-      </w:pPr>
-      <w:r>
-        <w:rPr>
-          <w:b/>
-        </w:rPr>
-        <w:t xml:space="preserve">Estilo — itálico para</w:t>
-      </w:r>
-      <w:r>
-        <w:rPr>
-          <w:b/>
-        </w:rPr>
-        <w:t xml:space="preserve"> </w:t>
-      </w:r>
-      <w:r>
-        <w:rPr>
-          <w:i/>
-          <w:b/>
-        </w:rPr>
-        <w:t xml:space="preserve">p</w:t>
-      </w:r>
-      <w:r>
-        <w:rPr>
-          <w:b/>
-        </w:rPr>
-        <w:t xml:space="preserve">:</w:t>
-      </w:r>
-      <w:r>
-        <w:t xml:space="preserve"> </w:t>
-      </w:r>
-      <w:r>
-        <w:t xml:space="preserve">Ao colar os parágrafos da nova redação no docx principal, aplicar itálico a toda ocorrência de</w:t>
-      </w:r>
-      <w:r>
-        <w:t xml:space="preserve"> </w:t>
-      </w:r>
-      <w:r>
-        <w:rPr>
-          <w:i/>
-        </w:rPr>
-        <w:t xml:space="preserve">p</w:t>
-      </w:r>
-      <w:r>
-        <w:t xml:space="preserve"> </w:t>
-      </w:r>
-      <w:r>
-        <w:t xml:space="preserve">estatístico nos textos corridos (ex:</w:t>
-      </w:r>
-      <w:r>
-        <w:t xml:space="preserve"> </w:t>
-      </w:r>
-      <w:r>
-        <w:rPr>
-          <w:i/>
-        </w:rPr>
-        <w:t xml:space="preserve">p</w:t>
-      </w:r>
-      <w:r>
-        <w:t xml:space="preserve"> </w:t>
-      </w:r>
-      <w:r>
-        <w:t xml:space="preserve">&lt; 0,001;</w:t>
-      </w:r>
-      <w:r>
-        <w:t xml:space="preserve"> </w:t>
-      </w:r>
-      <w:r>
-        <w:rPr>
-          <w:i/>
-        </w:rPr>
-        <w:t xml:space="preserve">p</w:t>
-      </w:r>
-      <w:r>
-        <w:t xml:space="preserve"> </w:t>
-      </w:r>
-      <w:r>
-        <w:t xml:space="preserve">= 0,337). Verifique também que os números nas tabelas usam vírgula decimal de forma consistente — as tabelas do docx já estão corretas, mas ao formatar no Word pode ser que formatações automáticas convertam vírgula para ponto.</w:t>
-      </w:r>
-    </w:p>
-    <w:p>
-      <w:pPr>
-        <w:pStyle w:val="Heading3"/>
-      </w:pPr>
-      <w:bookmarkStart w:id="43" w:name="para-o-eduardo"/>
-      <w:r>
-        <w:t xml:space="preserve">Para o Eduardo</w:t>
-      </w:r>
-      <w:bookmarkEnd w:id="43"/>
+      <w:bookmarkEnd w:id="46"/>
     </w:p>
     <w:p>
       <w:pPr>
@@ -6998,100 +8443,13 @@
         <w:rPr>
           <w:b/>
         </w:rPr>
-        <w:t xml:space="preserve">Causa raiz da divergência de N (6.646 vs 6.663):</w:t>
-      </w:r>
-      <w:r>
-        <w:t xml:space="preserve"> </w:t>
-      </w:r>
-      <w:r>
-        <w:t xml:space="preserve">Rerodar</w:t>
-      </w:r>
-      <w:r>
-        <w:t xml:space="preserve"> </w:t>
-      </w:r>
-      <w:r>
-        <w:rPr>
-          <w:rStyle w:val="VerbatimChar"/>
-        </w:rPr>
-        <w:t xml:space="preserve">quarto render index.qmd</w:t>
-      </w:r>
-      <w:r>
-        <w:t xml:space="preserve"> </w:t>
-      </w:r>
-      <w:r>
-        <w:t xml:space="preserve">e verificar se</w:t>
-      </w:r>
-      <w:r>
-        <w:t xml:space="preserve"> </w:t>
-      </w:r>
-      <w:r>
-        <w:rPr>
-          <w:rStyle w:val="VerbatimChar"/>
-        </w:rPr>
-        <w:t xml:space="preserve">tab_obj2_vias_parto_geral.csv</w:t>
-      </w:r>
-      <w:r>
-        <w:t xml:space="preserve"> </w:t>
-      </w:r>
-      <w:r>
-        <w:t xml:space="preserve">e</w:t>
-      </w:r>
-      <w:r>
-        <w:t xml:space="preserve"> </w:t>
-      </w:r>
-      <w:r>
-        <w:rPr>
-          <w:rStyle w:val="VerbatimChar"/>
-        </w:rPr>
-        <w:t xml:space="preserve">tab_obj2_taxa_cesarea.csv</w:t>
-      </w:r>
-      <w:r>
-        <w:t xml:space="preserve"> </w:t>
-      </w:r>
-      <w:r>
-        <w:t xml:space="preserve">produzem somas concordantes. Se divergirem, identificar o chunk com o filtro diferente. A hipótese mais provável é que um dos CSVs usa</w:t>
-      </w:r>
-      <w:r>
-        <w:t xml:space="preserve"> </w:t>
-      </w:r>
-      <w:r>
-        <w:rPr>
-          <w:rStyle w:val="VerbatimChar"/>
-        </w:rPr>
-        <w:t xml:space="preserve">dados_analise</w:t>
-      </w:r>
-      <w:r>
-        <w:t xml:space="preserve"> </w:t>
-      </w:r>
-      <w:r>
-        <w:t xml:space="preserve">e o outro usa</w:t>
-      </w:r>
-      <w:r>
-        <w:t xml:space="preserve"> </w:t>
-      </w:r>
-      <w:r>
-        <w:rPr>
-          <w:rStyle w:val="VerbatimChar"/>
-        </w:rPr>
-        <w:t xml:space="preserve">dados_s4</w:t>
-      </w:r>
-      <w:r>
-        <w:t xml:space="preserve"> </w:t>
-      </w:r>
-      <w:r>
-        <w:t xml:space="preserve">(antes de criar</w:t>
-      </w:r>
-      <w:r>
-        <w:t xml:space="preserve"> </w:t>
-      </w:r>
-      <w:r>
-        <w:rPr>
-          <w:rStyle w:val="VerbatimChar"/>
-        </w:rPr>
-        <w:t xml:space="preserve">faixa_etaria</w:t>
-      </w:r>
-      <w:r>
-        <w:t xml:space="preserve">), capturando casos com idade fora do range.</w:t>
+        <w:t xml:space="preserve">Decisão prioritária — o N:</w:t>
+      </w:r>
+      <w:r>
+        <w:t xml:space="preserve"> </w:t>
+      </w:r>
+      <w:r>
+        <w:t xml:space="preserve">Antes de colar qualquer tabela ou parágrafo no docx principal, definir com Eduardo qual N usar para as tabelas de análise (Tabelas 4–7): 6.646 (CSV primário de vias) ou 6.663 (CSV primário de taxa/Robson). Essa diferença de 17 casos precisa ser investigada e resolvida, não contornada. Uma vez definido, preencher os cinco placeholders.</w:t>
       </w:r>
     </w:p>
     <w:p>
@@ -7105,58 +8463,112 @@
         <w:rPr>
           <w:b/>
         </w:rPr>
-        <w:t xml:space="preserve">Deletar ou arquivar CSVs derivados conflitantes:</w:t>
-      </w:r>
-      <w:r>
-        <w:t xml:space="preserve"> </w:t>
-      </w:r>
-      <w:r>
-        <w:t xml:space="preserve">Os arquivos</w:t>
-      </w:r>
-      <w:r>
-        <w:t xml:space="preserve"> </w:t>
-      </w:r>
-      <w:r>
-        <w:rPr>
-          <w:rStyle w:val="VerbatimChar"/>
-        </w:rPr>
-        <w:t xml:space="preserve">results/tabelas_dissertacao/tab05_robson_faixa_via.csv</w:t>
-      </w:r>
-      <w:r>
-        <w:t xml:space="preserve"> </w:t>
-      </w:r>
-      <w:r>
-        <w:t xml:space="preserve">e</w:t>
-      </w:r>
-      <w:r>
-        <w:t xml:space="preserve"> </w:t>
-      </w:r>
-      <w:r>
-        <w:rPr>
-          <w:rStyle w:val="VerbatimChar"/>
-        </w:rPr>
-        <w:t xml:space="preserve">tab06_taxa_cesarea_robson.csv</w:t>
-      </w:r>
-      <w:r>
-        <w:t xml:space="preserve"> </w:t>
-      </w:r>
-      <w:r>
-        <w:t xml:space="preserve">têm valores diferentes dos primários e podem causar confusão. Arquivar em subpasta</w:t>
-      </w:r>
-      <w:r>
-        <w:t xml:space="preserve"> </w:t>
-      </w:r>
-      <w:r>
-        <w:rPr>
-          <w:rStyle w:val="VerbatimChar"/>
-        </w:rPr>
-        <w:t xml:space="preserve">_deprecated/</w:t>
-      </w:r>
-      <w:r>
-        <w:t xml:space="preserve"> </w:t>
-      </w:r>
-      <w:r>
-        <w:t xml:space="preserve">ou regenerar do zero garantindo que usam a mesma base.</w:t>
+        <w:t xml:space="preserve">Substituições no texto original da dissertação:</w:t>
+      </w:r>
+    </w:p>
+    <w:p>
+      <w:pPr>
+        <w:numPr>
+          <w:ilvl w:val="1"/>
+          <w:numId w:val="1007"/>
+        </w:numPr>
+        <w:pStyle w:val="Compact"/>
+      </w:pPr>
+      <w:r>
+        <w:t xml:space="preserve">§154: substituir</w:t>
+      </w:r>
+      <w:r>
+        <w:t xml:space="preserve"> </w:t>
+      </w:r>
+      <w:r>
+        <w:t xml:space="preserve">“</w:t>
+      </w:r>
+      <w:r>
+        <w:t xml:space="preserve">8.300 participantes, sendo 1.348 parturientes adolescentes e 6.952 adultas</w:t>
+      </w:r>
+      <w:r>
+        <w:t xml:space="preserve">”</w:t>
+      </w:r>
+      <w:r>
+        <w:t xml:space="preserve"> </w:t>
+      </w:r>
+      <w:r>
+        <w:t xml:space="preserve">pelos N definitivos.</w:t>
+      </w:r>
+    </w:p>
+    <w:p>
+      <w:pPr>
+        <w:numPr>
+          <w:ilvl w:val="1"/>
+          <w:numId w:val="1007"/>
+        </w:numPr>
+        <w:pStyle w:val="Compact"/>
+      </w:pPr>
+      <w:r>
+        <w:t xml:space="preserve">Legendas das Tabelas 1 e 2 originais: substituir</w:t>
+      </w:r>
+      <w:r>
+        <w:t xml:space="preserve"> </w:t>
+      </w:r>
+      <w:r>
+        <w:t xml:space="preserve">“</w:t>
+      </w:r>
+      <w:r>
+        <w:t xml:space="preserve">1.677 adolescentes e 7.047 adultas</w:t>
+      </w:r>
+      <w:r>
+        <w:t xml:space="preserve">”</w:t>
+      </w:r>
+      <w:r>
+        <w:t xml:space="preserve"> </w:t>
+      </w:r>
+      <w:r>
+        <w:t xml:space="preserve">pelos N definitivos.</w:t>
+      </w:r>
+    </w:p>
+    <w:p>
+      <w:pPr>
+        <w:numPr>
+          <w:ilvl w:val="1"/>
+          <w:numId w:val="1007"/>
+        </w:numPr>
+        <w:pStyle w:val="Compact"/>
+      </w:pPr>
+      <w:r>
+        <w:t xml:space="preserve">§160: substituir</w:t>
+      </w:r>
+      <w:r>
+        <w:t xml:space="preserve"> </w:t>
+      </w:r>
+      <w:r>
+        <w:t xml:space="preserve">“</w:t>
+      </w:r>
+      <w:r>
+        <w:t xml:space="preserve">p valor neste caso é de 0,06</w:t>
+      </w:r>
+      <w:r>
+        <w:t xml:space="preserve">”</w:t>
+      </w:r>
+      <w:r>
+        <w:t xml:space="preserve"> </w:t>
+      </w:r>
+      <w:r>
+        <w:t xml:space="preserve">por</w:t>
+      </w:r>
+      <w:r>
+        <w:t xml:space="preserve"> </w:t>
+      </w:r>
+      <w:r>
+        <w:t xml:space="preserve">“</w:t>
+      </w:r>
+      <w:r>
+        <w:t xml:space="preserve">p = 0,337</w:t>
+      </w:r>
+      <w:r>
+        <w:t xml:space="preserve">”</w:t>
+      </w:r>
+      <w:r>
+        <w:t xml:space="preserve">.</w:t>
       </w:r>
     </w:p>
     <w:p>
@@ -7170,73 +8582,13 @@
         <w:rPr>
           <w:b/>
         </w:rPr>
-        <w:t xml:space="preserve">Gerar Figuras 5 e 6:</w:t>
-      </w:r>
-      <w:r>
-        <w:t xml:space="preserve"> </w:t>
-      </w:r>
-      <w:r>
-        <w:t xml:space="preserve">Rodar os chunks de indicações do</w:t>
-      </w:r>
-      <w:r>
-        <w:t xml:space="preserve"> </w:t>
-      </w:r>
-      <w:r>
-        <w:rPr>
-          <w:rStyle w:val="VerbatimChar"/>
-        </w:rPr>
-        <w:t xml:space="preserve">index.qmd</w:t>
-      </w:r>
-      <w:r>
-        <w:t xml:space="preserve"> </w:t>
-      </w:r>
-      <w:r>
-        <w:t xml:space="preserve">e exportar como PNG em</w:t>
-      </w:r>
-      <w:r>
-        <w:t xml:space="preserve"> </w:t>
-      </w:r>
-      <w:r>
-        <w:rPr>
-          <w:rStyle w:val="VerbatimChar"/>
-        </w:rPr>
-        <w:t xml:space="preserve">results/figures/</w:t>
-      </w:r>
-      <w:r>
-        <w:t xml:space="preserve"> </w:t>
-      </w:r>
-      <w:r>
-        <w:t xml:space="preserve">com nomenclatura</w:t>
-      </w:r>
-      <w:r>
-        <w:t xml:space="preserve"> </w:t>
-      </w:r>
-      <w:r>
-        <w:rPr>
-          <w:rStyle w:val="VerbatimChar"/>
-        </w:rPr>
-        <w:t xml:space="preserve">fig_obj3_indicacoes_cesarea.png</w:t>
-      </w:r>
-      <w:r>
-        <w:t xml:space="preserve"> </w:t>
-      </w:r>
-      <w:r>
-        <w:t xml:space="preserve">e</w:t>
-      </w:r>
-      <w:r>
-        <w:t xml:space="preserve"> </w:t>
-      </w:r>
-      <w:r>
-        <w:rPr>
-          <w:rStyle w:val="VerbatimChar"/>
-        </w:rPr>
-        <w:t xml:space="preserve">fig_obj3_indicacoes_forcipe.png</w:t>
-      </w:r>
-      <w:r>
-        <w:t xml:space="preserve"> </w:t>
-      </w:r>
-      <w:r>
-        <w:t xml:space="preserve">(ou similar). Se a Figura 6 depender de dados que resultam todos em ND, suprimi-la.</w:t>
+        <w:t xml:space="preserve">Decisão sobre a Tabela 9 e os desfechos neonatais:</w:t>
+      </w:r>
+      <w:r>
+        <w:t xml:space="preserve"> </w:t>
+      </w:r>
+      <w:r>
+        <w:t xml:space="preserve">São duas decisões independentes que determinam se a dissertação terá 10 ou 11 tabelas. Recomendo tomar essas decisões antes de montar o docx final.</w:t>
       </w:r>
     </w:p>
     <w:p>
@@ -7250,40 +8602,13 @@
         <w:rPr>
           <w:b/>
         </w:rPr>
-        <w:t xml:space="preserve">Adicionar Figura 7 na redação:</w:t>
-      </w:r>
-      <w:r>
-        <w:t xml:space="preserve"> </w:t>
-      </w:r>
-      <w:r>
-        <w:t xml:space="preserve">Em</w:t>
-      </w:r>
-      <w:r>
-        <w:t xml:space="preserve"> </w:t>
-      </w:r>
-      <w:r>
-        <w:rPr>
-          <w:rStyle w:val="VerbatimChar"/>
-        </w:rPr>
-        <w:t xml:space="preserve">resultados_redacao.docx</w:t>
-      </w:r>
-      <w:r>
-        <w:t xml:space="preserve"> </w:t>
-      </w:r>
-      <w:r>
-        <w:t xml:space="preserve">§4.5, inserir referência à Figura 7 (forest plot do Modelo 4). O arquivo já existe em</w:t>
-      </w:r>
-      <w:r>
-        <w:t xml:space="preserve"> </w:t>
-      </w:r>
-      <w:r>
-        <w:rPr>
-          <w:rStyle w:val="VerbatimChar"/>
-        </w:rPr>
-        <w:t xml:space="preserve">results/figures/fig_obj5_forest_plot_modelo4.png</w:t>
-      </w:r>
-      <w:r>
-        <w:t xml:space="preserve">.</w:t>
+        <w:t xml:space="preserve">Verificar o valor de 56,3% (cor/raça):</w:t>
+      </w:r>
+      <w:r>
+        <w:t xml:space="preserve"> </w:t>
+      </w:r>
+      <w:r>
+        <w:t xml:space="preserve">Confirmar se o SPSS reporta exatamente 56,3% para o grupo adolescente combinado ou se o valor preciso é diferente. Ajustar §4.1.2 conforme necessário.</w:t>
       </w:r>
     </w:p>
     <w:p>
@@ -7297,67 +8622,460 @@
         <w:rPr>
           <w:b/>
         </w:rPr>
-        <w:t xml:space="preserve">Tabela 9 (se Opção A):</w:t>
-      </w:r>
-      <w:r>
-        <w:t xml:space="preserve"> </w:t>
-      </w:r>
-      <w:r>
-        <w:t xml:space="preserve">Cruzar</w:t>
-      </w:r>
-      <w:r>
-        <w:t xml:space="preserve"> </w:t>
-      </w:r>
-      <w:r>
-        <w:rPr>
-          <w:rStyle w:val="VerbatimChar"/>
-        </w:rPr>
-        <w:t xml:space="preserve">ind_final × tipo_parto</w:t>
-      </w:r>
-      <w:r>
-        <w:t xml:space="preserve"> </w:t>
-      </w:r>
-      <w:r>
-        <w:t xml:space="preserve">nos microdados para extrair indicações específicas de fórcipe. Isso resolve tanto a Tabela 9 quanto o detalhe de baixa cobertura da Tabela 8 para adolescentes.</w:t>
-      </w:r>
+        <w:t xml:space="preserve">Estilo — itálico para</w:t>
+      </w:r>
+      <w:r>
+        <w:rPr>
+          <w:b/>
+        </w:rPr>
+        <w:t xml:space="preserve"> </w:t>
+      </w:r>
+      <w:r>
+        <w:rPr>
+          <w:i/>
+          <w:b/>
+        </w:rPr>
+        <w:t xml:space="preserve">p</w:t>
+      </w:r>
+      <w:r>
+        <w:rPr>
+          <w:b/>
+        </w:rPr>
+        <w:t xml:space="preserve">:</w:t>
+      </w:r>
+      <w:r>
+        <w:t xml:space="preserve"> </w:t>
+      </w:r>
+      <w:r>
+        <w:t xml:space="preserve">Ao colar os parágrafos da nova redação no docx principal, aplicar itálico a toda ocorrência de</w:t>
+      </w:r>
+      <w:r>
+        <w:t xml:space="preserve"> </w:t>
+      </w:r>
+      <w:r>
+        <w:rPr>
+          <w:i/>
+        </w:rPr>
+        <w:t xml:space="preserve">p</w:t>
+      </w:r>
+      <w:r>
+        <w:t xml:space="preserve"> </w:t>
+      </w:r>
+      <w:r>
+        <w:t xml:space="preserve">estatístico nos textos corridos (ex:</w:t>
+      </w:r>
+      <w:r>
+        <w:t xml:space="preserve"> </w:t>
+      </w:r>
+      <w:r>
+        <w:rPr>
+          <w:i/>
+        </w:rPr>
+        <w:t xml:space="preserve">p</w:t>
+      </w:r>
+      <w:r>
+        <w:t xml:space="preserve"> </w:t>
+      </w:r>
+      <w:r>
+        <w:t xml:space="preserve">&lt; 0,001;</w:t>
+      </w:r>
+      <w:r>
+        <w:t xml:space="preserve"> </w:t>
+      </w:r>
+      <w:r>
+        <w:rPr>
+          <w:i/>
+        </w:rPr>
+        <w:t xml:space="preserve">p</w:t>
+      </w:r>
+      <w:r>
+        <w:t xml:space="preserve"> </w:t>
+      </w:r>
+      <w:r>
+        <w:t xml:space="preserve">= 0,337). Verifique também que os números nas tabelas usam vírgula decimal de forma consistente — as tabelas do docx já estão corretas, mas ao formatar no Word pode ser que formatações automáticas convertam vírgula para ponto.</w:t>
+      </w:r>
+    </w:p>
+    <w:p>
+      <w:pPr>
+        <w:pStyle w:val="Heading3"/>
+      </w:pPr>
+      <w:bookmarkStart w:id="47" w:name="para-o-eduardo"/>
+      <w:r>
+        <w:t xml:space="preserve">Para o Eduardo</w:t>
+      </w:r>
+      <w:bookmarkEnd w:id="47"/>
     </w:p>
     <w:p>
       <w:pPr>
         <w:numPr>
           <w:ilvl w:val="0"/>
-          <w:numId w:val="1006"/>
+          <w:numId w:val="1008"/>
         </w:numPr>
       </w:pPr>
       <w:r>
         <w:rPr>
           <w:b/>
         </w:rPr>
-        <w:t xml:space="preserve">Nota de rodapé na Tabela 8:</w:t>
-      </w:r>
-      <w:r>
-        <w:t xml:space="preserve"> </w:t>
-      </w:r>
-      <w:r>
-        <w:t xml:space="preserve">Acrescentar a informação de cobertura:</w:t>
-      </w:r>
-      <w:r>
-        <w:t xml:space="preserve"> </w:t>
-      </w:r>
-      <w:r>
-        <w:t xml:space="preserve">“</w:t>
-      </w:r>
-      <w:r>
-        <w:t xml:space="preserve">Partos operatórios com indicação registrada: 138/300 (46%) precoces; 227/496 (46%) tardias; 3.228/3.859 (84%) adultas.</w:t>
-      </w:r>
-      <w:r>
-        <w:t xml:space="preserve">”</w:t>
+        <w:t xml:space="preserve">Causa raiz da divergência de N (6.646 vs 6.663):</w:t>
+      </w:r>
+      <w:r>
+        <w:t xml:space="preserve"> </w:t>
+      </w:r>
+      <w:r>
+        <w:t xml:space="preserve">Rerodar</w:t>
+      </w:r>
+      <w:r>
+        <w:t xml:space="preserve"> </w:t>
+      </w:r>
+      <w:r>
+        <w:rPr>
+          <w:rStyle w:val="VerbatimChar"/>
+        </w:rPr>
+        <w:t xml:space="preserve">quarto render index.qmd</w:t>
+      </w:r>
+      <w:r>
+        <w:t xml:space="preserve"> </w:t>
+      </w:r>
+      <w:r>
+        <w:t xml:space="preserve">e verificar se</w:t>
+      </w:r>
+      <w:r>
+        <w:t xml:space="preserve"> </w:t>
+      </w:r>
+      <w:r>
+        <w:rPr>
+          <w:rStyle w:val="VerbatimChar"/>
+        </w:rPr>
+        <w:t xml:space="preserve">tab_obj2_vias_parto_geral.csv</w:t>
+      </w:r>
+      <w:r>
+        <w:t xml:space="preserve"> </w:t>
+      </w:r>
+      <w:r>
+        <w:t xml:space="preserve">e</w:t>
+      </w:r>
+      <w:r>
+        <w:t xml:space="preserve"> </w:t>
+      </w:r>
+      <w:r>
+        <w:rPr>
+          <w:rStyle w:val="VerbatimChar"/>
+        </w:rPr>
+        <w:t xml:space="preserve">tab_obj2_taxa_cesarea.csv</w:t>
+      </w:r>
+      <w:r>
+        <w:t xml:space="preserve"> </w:t>
+      </w:r>
+      <w:r>
+        <w:t xml:space="preserve">produzem somas concordantes. Se divergirem, identificar o chunk com o filtro diferente. A hipótese mais provável é que um dos CSVs usa</w:t>
+      </w:r>
+      <w:r>
+        <w:t xml:space="preserve"> </w:t>
+      </w:r>
+      <w:r>
+        <w:rPr>
+          <w:rStyle w:val="VerbatimChar"/>
+        </w:rPr>
+        <w:t xml:space="preserve">dados_analise</w:t>
+      </w:r>
+      <w:r>
+        <w:t xml:space="preserve"> </w:t>
+      </w:r>
+      <w:r>
+        <w:t xml:space="preserve">e o outro usa</w:t>
+      </w:r>
+      <w:r>
+        <w:t xml:space="preserve"> </w:t>
+      </w:r>
+      <w:r>
+        <w:rPr>
+          <w:rStyle w:val="VerbatimChar"/>
+        </w:rPr>
+        <w:t xml:space="preserve">dados_s4</w:t>
+      </w:r>
+      <w:r>
+        <w:t xml:space="preserve"> </w:t>
+      </w:r>
+      <w:r>
+        <w:t xml:space="preserve">(antes de criar</w:t>
+      </w:r>
+      <w:r>
+        <w:t xml:space="preserve"> </w:t>
+      </w:r>
+      <w:r>
+        <w:rPr>
+          <w:rStyle w:val="VerbatimChar"/>
+        </w:rPr>
+        <w:t xml:space="preserve">faixa_etaria</w:t>
+      </w:r>
+      <w:r>
+        <w:t xml:space="preserve">), capturando casos com idade fora do range.</w:t>
       </w:r>
     </w:p>
     <w:p>
       <w:pPr>
         <w:numPr>
           <w:ilvl w:val="0"/>
-          <w:numId w:val="1006"/>
+          <w:numId w:val="1008"/>
+        </w:numPr>
+      </w:pPr>
+      <w:r>
+        <w:rPr>
+          <w:b/>
+        </w:rPr>
+        <w:t xml:space="preserve">Deletar ou arquivar CSVs derivados conflitantes:</w:t>
+      </w:r>
+      <w:r>
+        <w:t xml:space="preserve"> </w:t>
+      </w:r>
+      <w:r>
+        <w:t xml:space="preserve">Os arquivos</w:t>
+      </w:r>
+      <w:r>
+        <w:t xml:space="preserve"> </w:t>
+      </w:r>
+      <w:r>
+        <w:rPr>
+          <w:rStyle w:val="VerbatimChar"/>
+        </w:rPr>
+        <w:t xml:space="preserve">results/tabelas_dissertacao/tab05_robson_faixa_via.csv</w:t>
+      </w:r>
+      <w:r>
+        <w:t xml:space="preserve"> </w:t>
+      </w:r>
+      <w:r>
+        <w:t xml:space="preserve">e</w:t>
+      </w:r>
+      <w:r>
+        <w:t xml:space="preserve"> </w:t>
+      </w:r>
+      <w:r>
+        <w:rPr>
+          <w:rStyle w:val="VerbatimChar"/>
+        </w:rPr>
+        <w:t xml:space="preserve">tab06_taxa_cesarea_robson.csv</w:t>
+      </w:r>
+      <w:r>
+        <w:t xml:space="preserve"> </w:t>
+      </w:r>
+      <w:r>
+        <w:t xml:space="preserve">têm valores diferentes dos primários e podem causar confusão. Arquivar em subpasta</w:t>
+      </w:r>
+      <w:r>
+        <w:t xml:space="preserve"> </w:t>
+      </w:r>
+      <w:r>
+        <w:rPr>
+          <w:rStyle w:val="VerbatimChar"/>
+        </w:rPr>
+        <w:t xml:space="preserve">_deprecated/</w:t>
+      </w:r>
+      <w:r>
+        <w:t xml:space="preserve"> </w:t>
+      </w:r>
+      <w:r>
+        <w:t xml:space="preserve">ou regenerar do zero garantindo que usam a mesma base.</w:t>
+      </w:r>
+    </w:p>
+    <w:p>
+      <w:pPr>
+        <w:numPr>
+          <w:ilvl w:val="0"/>
+          <w:numId w:val="1008"/>
+        </w:numPr>
+      </w:pPr>
+      <w:r>
+        <w:rPr>
+          <w:b/>
+        </w:rPr>
+        <w:t xml:space="preserve">Gerar Figuras 5 e 6:</w:t>
+      </w:r>
+      <w:r>
+        <w:t xml:space="preserve"> </w:t>
+      </w:r>
+      <w:r>
+        <w:t xml:space="preserve">Rodar os chunks de indicações do</w:t>
+      </w:r>
+      <w:r>
+        <w:t xml:space="preserve"> </w:t>
+      </w:r>
+      <w:r>
+        <w:rPr>
+          <w:rStyle w:val="VerbatimChar"/>
+        </w:rPr>
+        <w:t xml:space="preserve">index.qmd</w:t>
+      </w:r>
+      <w:r>
+        <w:t xml:space="preserve"> </w:t>
+      </w:r>
+      <w:r>
+        <w:t xml:space="preserve">e exportar como PNG em</w:t>
+      </w:r>
+      <w:r>
+        <w:t xml:space="preserve"> </w:t>
+      </w:r>
+      <w:r>
+        <w:rPr>
+          <w:rStyle w:val="VerbatimChar"/>
+        </w:rPr>
+        <w:t xml:space="preserve">results/figures/</w:t>
+      </w:r>
+      <w:r>
+        <w:t xml:space="preserve"> </w:t>
+      </w:r>
+      <w:r>
+        <w:t xml:space="preserve">com nomenclatura</w:t>
+      </w:r>
+      <w:r>
+        <w:t xml:space="preserve"> </w:t>
+      </w:r>
+      <w:r>
+        <w:rPr>
+          <w:rStyle w:val="VerbatimChar"/>
+        </w:rPr>
+        <w:t xml:space="preserve">fig_obj3_indicacoes_cesarea.png</w:t>
+      </w:r>
+      <w:r>
+        <w:t xml:space="preserve"> </w:t>
+      </w:r>
+      <w:r>
+        <w:t xml:space="preserve">e</w:t>
+      </w:r>
+      <w:r>
+        <w:t xml:space="preserve"> </w:t>
+      </w:r>
+      <w:r>
+        <w:rPr>
+          <w:rStyle w:val="VerbatimChar"/>
+        </w:rPr>
+        <w:t xml:space="preserve">fig_obj3_indicacoes_forcipe.png</w:t>
+      </w:r>
+      <w:r>
+        <w:t xml:space="preserve"> </w:t>
+      </w:r>
+      <w:r>
+        <w:t xml:space="preserve">(ou similar). Se a Figura 6 depender de dados que resultam todos em ND, suprimi-la.</w:t>
+      </w:r>
+    </w:p>
+    <w:p>
+      <w:pPr>
+        <w:numPr>
+          <w:ilvl w:val="0"/>
+          <w:numId w:val="1008"/>
+        </w:numPr>
+      </w:pPr>
+      <w:r>
+        <w:rPr>
+          <w:b/>
+        </w:rPr>
+        <w:t xml:space="preserve">Adicionar Figura 7 na redação:</w:t>
+      </w:r>
+      <w:r>
+        <w:t xml:space="preserve"> </w:t>
+      </w:r>
+      <w:r>
+        <w:t xml:space="preserve">Em</w:t>
+      </w:r>
+      <w:r>
+        <w:t xml:space="preserve"> </w:t>
+      </w:r>
+      <w:r>
+        <w:rPr>
+          <w:rStyle w:val="VerbatimChar"/>
+        </w:rPr>
+        <w:t xml:space="preserve">resultados_redacao.docx</w:t>
+      </w:r>
+      <w:r>
+        <w:t xml:space="preserve"> </w:t>
+      </w:r>
+      <w:r>
+        <w:t xml:space="preserve">§4.5, inserir referência à Figura 7 (forest plot do Modelo 4). O arquivo já existe em</w:t>
+      </w:r>
+      <w:r>
+        <w:t xml:space="preserve"> </w:t>
+      </w:r>
+      <w:r>
+        <w:rPr>
+          <w:rStyle w:val="VerbatimChar"/>
+        </w:rPr>
+        <w:t xml:space="preserve">results/figures/fig_obj5_forest_plot_modelo4.png</w:t>
+      </w:r>
+      <w:r>
+        <w:t xml:space="preserve">.</w:t>
+      </w:r>
+    </w:p>
+    <w:p>
+      <w:pPr>
+        <w:numPr>
+          <w:ilvl w:val="0"/>
+          <w:numId w:val="1008"/>
+        </w:numPr>
+      </w:pPr>
+      <w:r>
+        <w:rPr>
+          <w:b/>
+        </w:rPr>
+        <w:t xml:space="preserve">Tabela 9 (se Opção A):</w:t>
+      </w:r>
+      <w:r>
+        <w:t xml:space="preserve"> </w:t>
+      </w:r>
+      <w:r>
+        <w:t xml:space="preserve">Cruzar</w:t>
+      </w:r>
+      <w:r>
+        <w:t xml:space="preserve"> </w:t>
+      </w:r>
+      <w:r>
+        <w:rPr>
+          <w:rStyle w:val="VerbatimChar"/>
+        </w:rPr>
+        <w:t xml:space="preserve">ind_final × tipo_parto</w:t>
+      </w:r>
+      <w:r>
+        <w:t xml:space="preserve"> </w:t>
+      </w:r>
+      <w:r>
+        <w:t xml:space="preserve">nos microdados para extrair indicações específicas de fórcipe. Isso resolve tanto a Tabela 9 quanto o detalhe de baixa cobertura da Tabela 8 para adolescentes.</w:t>
+      </w:r>
+    </w:p>
+    <w:p>
+      <w:pPr>
+        <w:numPr>
+          <w:ilvl w:val="0"/>
+          <w:numId w:val="1008"/>
+        </w:numPr>
+      </w:pPr>
+      <w:r>
+        <w:rPr>
+          <w:b/>
+        </w:rPr>
+        <w:t xml:space="preserve">Nota de rodapé na Tabela 8:</w:t>
+      </w:r>
+      <w:r>
+        <w:t xml:space="preserve"> </w:t>
+      </w:r>
+      <w:r>
+        <w:t xml:space="preserve">Acrescentar a informação de cobertura:</w:t>
+      </w:r>
+      <w:r>
+        <w:t xml:space="preserve"> </w:t>
+      </w:r>
+      <w:r>
+        <w:t xml:space="preserve">“</w:t>
+      </w:r>
+      <w:r>
+        <w:t xml:space="preserve">Partos operatórios com indicação registrada: 138/300 (46%) precoces; 227/496 (46%) tardias; 3.228/3.859 (84%) adultas.</w:t>
+      </w:r>
+      <w:r>
+        <w:t xml:space="preserve">”</w:t>
+      </w:r>
+    </w:p>
+    <w:p>
+      <w:pPr>
+        <w:numPr>
+          <w:ilvl w:val="0"/>
+          <w:numId w:val="1008"/>
         </w:numPr>
       </w:pPr>
       <w:r>
@@ -7480,11 +9198,11 @@
       <w:pPr>
         <w:pStyle w:val="Heading2"/>
       </w:pPr>
-      <w:bookmarkStart w:id="44" w:name="X854fb30dc90e75aaa72bb6b1fbbfb706ab72eb6"/>
+      <w:bookmarkStart w:id="48" w:name="X854fb30dc90e75aaa72bb6b1fbbfb706ab72eb6"/>
       <w:r>
         <w:t xml:space="preserve">Apêndice — Rastreabilidade dos Placeholders</w:t>
       </w:r>
-      <w:bookmarkEnd w:id="44"/>
+      <w:bookmarkEnd w:id="48"/>
     </w:p>
     <w:tbl>
       <w:tblPr>
@@ -7948,111 +9666,8 @@
       </w:pPr>
     </w:lvl>
   </w:abstractNum>
-  <w:abstractNum w:abstractNumId="991">
+  <w:abstractNum w:abstractNumId="99411">
     <w:nsid w:val="ea454b4c"/>
-    <w:multiLevelType w:val="multilevel"/>
-    <w:lvl w:ilvl="0">
-      <w:numFmt w:val="bullet"/>
-      <w:lvlText w:val="•"/>
-      <w:lvlJc w:val="left"/>
-      <w:pPr>
-        <w:tabs>
-          <w:tab w:val="num" w:pos="0"/>
-        </w:tabs>
-        <w:ind w:left="480" w:hanging="480"/>
-      </w:pPr>
-    </w:lvl>
-    <w:lvl w:ilvl="1">
-      <w:numFmt w:val="bullet"/>
-      <w:lvlText w:val="–"/>
-      <w:lvlJc w:val="left"/>
-      <w:pPr>
-        <w:tabs>
-          <w:tab w:val="num" w:pos="720"/>
-        </w:tabs>
-        <w:ind w:left="1200" w:hanging="480"/>
-      </w:pPr>
-    </w:lvl>
-    <w:lvl w:ilvl="2">
-      <w:numFmt w:val="bullet"/>
-      <w:lvlText w:val="•"/>
-      <w:lvlJc w:val="left"/>
-      <w:pPr>
-        <w:tabs>
-          <w:tab w:val="num" w:pos="1440"/>
-        </w:tabs>
-        <w:ind w:left="1920" w:hanging="480"/>
-      </w:pPr>
-    </w:lvl>
-    <w:lvl w:ilvl="3">
-      <w:numFmt w:val="bullet"/>
-      <w:lvlText w:val="–"/>
-      <w:lvlJc w:val="left"/>
-      <w:pPr>
-        <w:tabs>
-          <w:tab w:val="num" w:pos="2160"/>
-        </w:tabs>
-        <w:ind w:left="2640" w:hanging="480"/>
-      </w:pPr>
-    </w:lvl>
-    <w:lvl w:ilvl="4">
-      <w:numFmt w:val="bullet"/>
-      <w:lvlText w:val="•"/>
-      <w:lvlJc w:val="left"/>
-      <w:pPr>
-        <w:tabs>
-          <w:tab w:val="num" w:pos="2880"/>
-        </w:tabs>
-        <w:ind w:left="3360" w:hanging="480"/>
-      </w:pPr>
-    </w:lvl>
-    <w:lvl w:ilvl="5">
-      <w:numFmt w:val="bullet"/>
-      <w:lvlText w:val="–"/>
-      <w:lvlJc w:val="left"/>
-      <w:pPr>
-        <w:tabs>
-          <w:tab w:val="num" w:pos="3600"/>
-        </w:tabs>
-        <w:ind w:left="4080" w:hanging="480"/>
-      </w:pPr>
-    </w:lvl>
-    <w:lvl w:ilvl="6">
-      <w:numFmt w:val="bullet"/>
-      <w:lvlText w:val="•"/>
-      <w:lvlJc w:val="left"/>
-      <w:pPr>
-        <w:tabs>
-          <w:tab w:val="num" w:pos="4320"/>
-        </w:tabs>
-        <w:ind w:left="4800" w:hanging="480"/>
-      </w:pPr>
-    </w:lvl>
-    <w:lvl w:ilvl="7">
-      <w:numFmt w:val="bullet"/>
-      <w:lvlText w:val="–"/>
-      <w:lvlJc w:val="left"/>
-      <w:pPr>
-        <w:tabs>
-          <w:tab w:val="num" w:pos="5040"/>
-        </w:tabs>
-        <w:ind w:left="5520" w:hanging="480"/>
-      </w:pPr>
-    </w:lvl>
-    <w:lvl w:ilvl="8">
-      <w:numFmt w:val="bullet"/>
-      <w:lvlText w:val="•"/>
-      <w:lvlJc w:val="left"/>
-      <w:pPr>
-        <w:tabs>
-          <w:tab w:val="num" w:pos="5760"/>
-        </w:tabs>
-        <w:ind w:left="6240" w:hanging="480"/>
-      </w:pPr>
-    </w:lvl>
-  </w:abstractNum>
-  <w:abstractNum w:abstractNumId="99411">
-    <w:nsid w:val="71315dca"/>
     <w:multiLevelType w:val="multilevel"/>
     <w:lvl w:ilvl="0">
       <w:start w:val="1"/>
@@ -8163,16 +9778,113 @@
       </w:pPr>
     </w:lvl>
   </w:abstractNum>
+  <w:abstractNum w:abstractNumId="991">
+    <w:nsid w:val="71315dca"/>
+    <w:multiLevelType w:val="multilevel"/>
+    <w:lvl w:ilvl="0">
+      <w:numFmt w:val="bullet"/>
+      <w:lvlText w:val="•"/>
+      <w:lvlJc w:val="left"/>
+      <w:pPr>
+        <w:tabs>
+          <w:tab w:val="num" w:pos="0"/>
+        </w:tabs>
+        <w:ind w:left="480" w:hanging="480"/>
+      </w:pPr>
+    </w:lvl>
+    <w:lvl w:ilvl="1">
+      <w:numFmt w:val="bullet"/>
+      <w:lvlText w:val="–"/>
+      <w:lvlJc w:val="left"/>
+      <w:pPr>
+        <w:tabs>
+          <w:tab w:val="num" w:pos="720"/>
+        </w:tabs>
+        <w:ind w:left="1200" w:hanging="480"/>
+      </w:pPr>
+    </w:lvl>
+    <w:lvl w:ilvl="2">
+      <w:numFmt w:val="bullet"/>
+      <w:lvlText w:val="•"/>
+      <w:lvlJc w:val="left"/>
+      <w:pPr>
+        <w:tabs>
+          <w:tab w:val="num" w:pos="1440"/>
+        </w:tabs>
+        <w:ind w:left="1920" w:hanging="480"/>
+      </w:pPr>
+    </w:lvl>
+    <w:lvl w:ilvl="3">
+      <w:numFmt w:val="bullet"/>
+      <w:lvlText w:val="–"/>
+      <w:lvlJc w:val="left"/>
+      <w:pPr>
+        <w:tabs>
+          <w:tab w:val="num" w:pos="2160"/>
+        </w:tabs>
+        <w:ind w:left="2640" w:hanging="480"/>
+      </w:pPr>
+    </w:lvl>
+    <w:lvl w:ilvl="4">
+      <w:numFmt w:val="bullet"/>
+      <w:lvlText w:val="•"/>
+      <w:lvlJc w:val="left"/>
+      <w:pPr>
+        <w:tabs>
+          <w:tab w:val="num" w:pos="2880"/>
+        </w:tabs>
+        <w:ind w:left="3360" w:hanging="480"/>
+      </w:pPr>
+    </w:lvl>
+    <w:lvl w:ilvl="5">
+      <w:numFmt w:val="bullet"/>
+      <w:lvlText w:val="–"/>
+      <w:lvlJc w:val="left"/>
+      <w:pPr>
+        <w:tabs>
+          <w:tab w:val="num" w:pos="3600"/>
+        </w:tabs>
+        <w:ind w:left="4080" w:hanging="480"/>
+      </w:pPr>
+    </w:lvl>
+    <w:lvl w:ilvl="6">
+      <w:numFmt w:val="bullet"/>
+      <w:lvlText w:val="•"/>
+      <w:lvlJc w:val="left"/>
+      <w:pPr>
+        <w:tabs>
+          <w:tab w:val="num" w:pos="4320"/>
+        </w:tabs>
+        <w:ind w:left="4800" w:hanging="480"/>
+      </w:pPr>
+    </w:lvl>
+    <w:lvl w:ilvl="7">
+      <w:numFmt w:val="bullet"/>
+      <w:lvlText w:val="–"/>
+      <w:lvlJc w:val="left"/>
+      <w:pPr>
+        <w:tabs>
+          <w:tab w:val="num" w:pos="5040"/>
+        </w:tabs>
+        <w:ind w:left="5520" w:hanging="480"/>
+      </w:pPr>
+    </w:lvl>
+    <w:lvl w:ilvl="8">
+      <w:numFmt w:val="bullet"/>
+      <w:lvlText w:val="•"/>
+      <w:lvlJc w:val="left"/>
+      <w:pPr>
+        <w:tabs>
+          <w:tab w:val="num" w:pos="5760"/>
+        </w:tabs>
+        <w:ind w:left="6240" w:hanging="480"/>
+      </w:pPr>
+    </w:lvl>
+  </w:abstractNum>
   <w:num w:numId="1000">
     <w:abstractNumId w:val="990"/>
   </w:num>
   <w:num w:numId="1001">
-    <w:abstractNumId w:val="991"/>
-  </w:num>
-  <w:num w:numId="1002">
-    <w:abstractNumId w:val="991"/>
-  </w:num>
-  <w:num w:numId="1003">
     <w:abstractNumId w:val="99411"/>
     <w:lvlOverride w:ilvl="0">
       <w:startOverride w:val="1"/>
@@ -8202,7 +9914,16 @@
       <w:startOverride w:val="1"/>
     </w:lvlOverride>
   </w:num>
+  <w:num w:numId="1002">
+    <w:abstractNumId w:val="991"/>
+  </w:num>
+  <w:num w:numId="1003">
+    <w:abstractNumId w:val="991"/>
+  </w:num>
   <w:num w:numId="1004">
+    <w:abstractNumId w:val="991"/>
+  </w:num>
+  <w:num w:numId="1005">
     <w:abstractNumId w:val="99411"/>
     <w:lvlOverride w:ilvl="0">
       <w:startOverride w:val="1"/>
@@ -8232,10 +9953,40 @@
       <w:startOverride w:val="1"/>
     </w:lvlOverride>
   </w:num>
-  <w:num w:numId="1005">
+  <w:num w:numId="1006">
+    <w:abstractNumId w:val="99411"/>
+    <w:lvlOverride w:ilvl="0">
+      <w:startOverride w:val="1"/>
+    </w:lvlOverride>
+    <w:lvlOverride w:ilvl="1">
+      <w:startOverride w:val="1"/>
+    </w:lvlOverride>
+    <w:lvlOverride w:ilvl="2">
+      <w:startOverride w:val="1"/>
+    </w:lvlOverride>
+    <w:lvlOverride w:ilvl="3">
+      <w:startOverride w:val="1"/>
+    </w:lvlOverride>
+    <w:lvlOverride w:ilvl="4">
+      <w:startOverride w:val="1"/>
+    </w:lvlOverride>
+    <w:lvlOverride w:ilvl="5">
+      <w:startOverride w:val="1"/>
+    </w:lvlOverride>
+    <w:lvlOverride w:ilvl="6">
+      <w:startOverride w:val="1"/>
+    </w:lvlOverride>
+    <w:lvlOverride w:ilvl="7">
+      <w:startOverride w:val="1"/>
+    </w:lvlOverride>
+    <w:lvlOverride w:ilvl="8">
+      <w:startOverride w:val="1"/>
+    </w:lvlOverride>
+  </w:num>
+  <w:num w:numId="1007">
     <w:abstractNumId w:val="991"/>
   </w:num>
-  <w:num w:numId="1006">
+  <w:num w:numId="1008">
     <w:abstractNumId w:val="99411"/>
     <w:lvlOverride w:ilvl="0">
       <w:startOverride w:val="1"/>

</xml_diff>